<commit_message>
added steps of to be process in to be documentation
</commit_message>
<xml_diff>
--- a/01RetailEasy Documentation.docx
+++ b/01RetailEasy Documentation.docx
@@ -17,6 +17,8 @@
     </w:p>
     <w:p>
       <w:pPr>
+        <w:spacing w:line="180" w:lineRule="auto"/>
+        <w:jc w:val="center"/>
         <w:rPr>
           <w:rFonts w:ascii="Times New Roman" w:hAnsi="Times New Roman" w:cs="Times New Roman"/>
           <w:b/>
@@ -25,7 +27,11 @@
           <w:szCs w:val="36"/>
         </w:rPr>
       </w:pPr>
-      <w:r>
+    </w:p>
+    <w:p>
+      <w:pPr>
+        <w:spacing w:line="180" w:lineRule="auto"/>
+        <w:jc w:val="center"/>
         <w:rPr>
           <w:rFonts w:ascii="Times New Roman" w:hAnsi="Times New Roman" w:cs="Times New Roman"/>
           <w:b/>
@@ -33,11 +39,12 @@
           <w:sz w:val="36"/>
           <w:szCs w:val="36"/>
         </w:rPr>
-        <w:t>RetailEasy Pvt. Ltd.</w:t>
-      </w:r>
-    </w:p>
-    <w:p>
-      <w:pPr>
+      </w:pPr>
+    </w:p>
+    <w:p>
+      <w:pPr>
+        <w:spacing w:line="180" w:lineRule="auto"/>
+        <w:jc w:val="center"/>
         <w:rPr>
           <w:rFonts w:ascii="Times New Roman" w:hAnsi="Times New Roman" w:cs="Times New Roman"/>
           <w:b/>
@@ -46,7 +53,11 @@
           <w:szCs w:val="36"/>
         </w:rPr>
       </w:pPr>
-      <w:r>
+    </w:p>
+    <w:p>
+      <w:pPr>
+        <w:spacing w:line="180" w:lineRule="auto"/>
+        <w:jc w:val="center"/>
         <w:rPr>
           <w:rFonts w:ascii="Times New Roman" w:hAnsi="Times New Roman" w:cs="Times New Roman"/>
           <w:b/>
@@ -54,11 +65,12 @@
           <w:sz w:val="36"/>
           <w:szCs w:val="36"/>
         </w:rPr>
-        <w:t>Returns Process Automation Project Charter</w:t>
-      </w:r>
-    </w:p>
-    <w:p>
-      <w:pPr>
+      </w:pPr>
+    </w:p>
+    <w:p>
+      <w:pPr>
+        <w:spacing w:line="180" w:lineRule="auto"/>
+        <w:jc w:val="center"/>
         <w:rPr>
           <w:rFonts w:ascii="Times New Roman" w:hAnsi="Times New Roman" w:cs="Times New Roman"/>
           <w:b/>
@@ -71,37 +83,7 @@
     <w:p>
       <w:pPr>
         <w:spacing w:line="180" w:lineRule="auto"/>
-      </w:pPr>
-      <w:r>
-        <w:t>Prepared By: Pooja Suresh Chavan</w:t>
-      </w:r>
-    </w:p>
-    <w:p>
-      <w:pPr>
-        <w:spacing w:line="180" w:lineRule="auto"/>
-      </w:pPr>
-      <w:r>
-        <w:t>Role: Business Analyst</w:t>
-      </w:r>
-    </w:p>
-    <w:p>
-      <w:pPr>
-        <w:spacing w:line="180" w:lineRule="auto"/>
-      </w:pPr>
-      <w:r>
-        <w:t>Project Type: Process Improvement &amp; Requirements Engineering</w:t>
-      </w:r>
-    </w:p>
-    <w:p>
-      <w:pPr>
-        <w:spacing w:line="180" w:lineRule="auto"/>
-      </w:pPr>
-      <w:r>
-        <w:t>Date: May 2026</w:t>
-      </w:r>
-    </w:p>
-    <w:p>
-      <w:pPr>
+        <w:jc w:val="center"/>
         <w:rPr>
           <w:rFonts w:ascii="Times New Roman" w:hAnsi="Times New Roman" w:cs="Times New Roman"/>
           <w:b/>
@@ -113,6 +95,118 @@
     </w:p>
     <w:p>
       <w:pPr>
+        <w:spacing w:line="180" w:lineRule="auto"/>
+        <w:rPr>
+          <w:rFonts w:ascii="Times New Roman" w:hAnsi="Times New Roman" w:cs="Times New Roman"/>
+          <w:b/>
+          <w:bCs/>
+          <w:sz w:val="96"/>
+          <w:szCs w:val="96"/>
+        </w:rPr>
+      </w:pPr>
+    </w:p>
+    <w:p>
+      <w:pPr>
+        <w:pBdr>
+          <w:top w:val="thinThickThinSmallGap" w:sz="24" w:space="1" w:color="auto"/>
+          <w:left w:val="thinThickThinSmallGap" w:sz="24" w:space="4" w:color="auto"/>
+          <w:bottom w:val="thinThickThinSmallGap" w:sz="24" w:space="1" w:color="auto"/>
+          <w:right w:val="thinThickThinSmallGap" w:sz="24" w:space="4" w:color="auto"/>
+        </w:pBdr>
+        <w:jc w:val="center"/>
+        <w:rPr>
+          <w:rFonts w:ascii="Algerian" w:hAnsi="Algerian" w:cs="Times New Roman"/>
+          <w:b/>
+          <w:bCs/>
+          <w:color w:val="2F5496" w:themeColor="accent1" w:themeShade="BF"/>
+          <w:sz w:val="96"/>
+          <w:szCs w:val="96"/>
+        </w:rPr>
+      </w:pPr>
+      <w:proofErr w:type="spellStart"/>
+      <w:r>
+        <w:rPr>
+          <w:rFonts w:ascii="Algerian" w:hAnsi="Algerian" w:cs="Times New Roman"/>
+          <w:b/>
+          <w:bCs/>
+          <w:color w:val="2F5496" w:themeColor="accent1" w:themeShade="BF"/>
+          <w:sz w:val="96"/>
+          <w:szCs w:val="96"/>
+        </w:rPr>
+        <w:t>RetailEasy</w:t>
+      </w:r>
+      <w:proofErr w:type="spellEnd"/>
+      <w:r>
+        <w:rPr>
+          <w:rFonts w:ascii="Algerian" w:hAnsi="Algerian" w:cs="Times New Roman"/>
+          <w:b/>
+          <w:bCs/>
+          <w:color w:val="2F5496" w:themeColor="accent1" w:themeShade="BF"/>
+          <w:sz w:val="96"/>
+          <w:szCs w:val="96"/>
+        </w:rPr>
+        <w:t xml:space="preserve"> </w:t>
+      </w:r>
+      <w:proofErr w:type="spellStart"/>
+      <w:r>
+        <w:rPr>
+          <w:rFonts w:ascii="Algerian" w:hAnsi="Algerian" w:cs="Times New Roman"/>
+          <w:b/>
+          <w:bCs/>
+          <w:color w:val="2F5496" w:themeColor="accent1" w:themeShade="BF"/>
+          <w:sz w:val="96"/>
+          <w:szCs w:val="96"/>
+        </w:rPr>
+        <w:t>Pvt.</w:t>
+      </w:r>
+      <w:proofErr w:type="spellEnd"/>
+      <w:r>
+        <w:rPr>
+          <w:rFonts w:ascii="Algerian" w:hAnsi="Algerian" w:cs="Times New Roman"/>
+          <w:b/>
+          <w:bCs/>
+          <w:color w:val="2F5496" w:themeColor="accent1" w:themeShade="BF"/>
+          <w:sz w:val="96"/>
+          <w:szCs w:val="96"/>
+        </w:rPr>
+        <w:t xml:space="preserve"> Ltd.</w:t>
+      </w:r>
+    </w:p>
+    <w:p>
+      <w:pPr>
+        <w:pBdr>
+          <w:top w:val="thinThickThinSmallGap" w:sz="24" w:space="1" w:color="auto"/>
+          <w:left w:val="thinThickThinSmallGap" w:sz="24" w:space="4" w:color="auto"/>
+          <w:bottom w:val="thinThickThinSmallGap" w:sz="24" w:space="1" w:color="auto"/>
+          <w:right w:val="thinThickThinSmallGap" w:sz="24" w:space="4" w:color="auto"/>
+        </w:pBdr>
+        <w:jc w:val="center"/>
+        <w:rPr>
+          <w:rFonts w:ascii="Times New Roman" w:hAnsi="Times New Roman" w:cs="Times New Roman"/>
+          <w:b/>
+          <w:bCs/>
+          <w:color w:val="2F5496" w:themeColor="accent1" w:themeShade="BF"/>
+          <w:sz w:val="40"/>
+          <w:szCs w:val="40"/>
+          <w:u w:val="single"/>
+        </w:rPr>
+      </w:pPr>
+      <w:r>
+        <w:rPr>
+          <w:rFonts w:ascii="Times New Roman" w:hAnsi="Times New Roman" w:cs="Times New Roman"/>
+          <w:b/>
+          <w:bCs/>
+          <w:color w:val="2F5496" w:themeColor="accent1" w:themeShade="BF"/>
+          <w:sz w:val="40"/>
+          <w:szCs w:val="40"/>
+          <w:u w:val="single"/>
+        </w:rPr>
+        <w:t>Returns Process Automation Project Charter</w:t>
+      </w:r>
+    </w:p>
+    <w:p>
+      <w:pPr>
+        <w:jc w:val="center"/>
         <w:rPr>
           <w:rFonts w:ascii="Times New Roman" w:hAnsi="Times New Roman" w:cs="Times New Roman"/>
           <w:b/>
@@ -121,7 +215,85 @@
           <w:szCs w:val="36"/>
         </w:rPr>
       </w:pPr>
-      <w:r>
+    </w:p>
+    <w:p>
+      <w:pPr>
+        <w:spacing w:line="180" w:lineRule="auto"/>
+        <w:ind w:left="5760"/>
+        <w:rPr>
+          <w:color w:val="767171" w:themeColor="background2" w:themeShade="80"/>
+          <w:sz w:val="28"/>
+          <w:szCs w:val="28"/>
+        </w:rPr>
+      </w:pPr>
+      <w:r>
+        <w:rPr>
+          <w:color w:val="767171" w:themeColor="background2" w:themeShade="80"/>
+          <w:sz w:val="28"/>
+          <w:szCs w:val="28"/>
+        </w:rPr>
+        <w:t>Prepared By: Pooja Suresh Chavan</w:t>
+      </w:r>
+    </w:p>
+    <w:p>
+      <w:pPr>
+        <w:spacing w:line="180" w:lineRule="auto"/>
+        <w:ind w:left="5760"/>
+        <w:rPr>
+          <w:color w:val="767171" w:themeColor="background2" w:themeShade="80"/>
+          <w:sz w:val="28"/>
+          <w:szCs w:val="28"/>
+        </w:rPr>
+      </w:pPr>
+      <w:r>
+        <w:rPr>
+          <w:color w:val="767171" w:themeColor="background2" w:themeShade="80"/>
+          <w:sz w:val="28"/>
+          <w:szCs w:val="28"/>
+        </w:rPr>
+        <w:t>Role: Business Analyst</w:t>
+      </w:r>
+    </w:p>
+    <w:p>
+      <w:pPr>
+        <w:spacing w:line="180" w:lineRule="auto"/>
+        <w:ind w:left="5760"/>
+        <w:rPr>
+          <w:color w:val="767171" w:themeColor="background2" w:themeShade="80"/>
+          <w:sz w:val="28"/>
+          <w:szCs w:val="28"/>
+        </w:rPr>
+      </w:pPr>
+      <w:r>
+        <w:rPr>
+          <w:color w:val="767171" w:themeColor="background2" w:themeShade="80"/>
+          <w:sz w:val="28"/>
+          <w:szCs w:val="28"/>
+        </w:rPr>
+        <w:t>Project Type: Process Improvement &amp; Requirements Engineering</w:t>
+      </w:r>
+    </w:p>
+    <w:p>
+      <w:pPr>
+        <w:spacing w:line="180" w:lineRule="auto"/>
+        <w:ind w:left="5760"/>
+        <w:rPr>
+          <w:color w:val="767171" w:themeColor="background2" w:themeShade="80"/>
+          <w:sz w:val="28"/>
+          <w:szCs w:val="28"/>
+        </w:rPr>
+      </w:pPr>
+      <w:r>
+        <w:rPr>
+          <w:color w:val="767171" w:themeColor="background2" w:themeShade="80"/>
+          <w:sz w:val="28"/>
+          <w:szCs w:val="28"/>
+        </w:rPr>
+        <w:t>Date: May 2026</w:t>
+      </w:r>
+    </w:p>
+    <w:p>
+      <w:pPr>
         <w:rPr>
           <w:rFonts w:ascii="Times New Roman" w:hAnsi="Times New Roman" w:cs="Times New Roman"/>
           <w:b/>
@@ -129,8 +301,7 @@
           <w:sz w:val="36"/>
           <w:szCs w:val="36"/>
         </w:rPr>
-        <w:br w:type="page"/>
-      </w:r>
+      </w:pPr>
     </w:p>
     <w:p>
       <w:pPr>
@@ -150,31 +321,90 @@
           <w:sz w:val="36"/>
           <w:szCs w:val="36"/>
         </w:rPr>
-        <w:lastRenderedPageBreak/>
-        <w:t xml:space="preserve">Table of Content </w:t>
-      </w:r>
+        <w:br w:type="page"/>
+      </w:r>
+    </w:p>
+    <w:p>
+      <w:pPr>
+        <w:rPr>
+          <w:rFonts w:ascii="Times New Roman" w:hAnsi="Times New Roman" w:cs="Times New Roman"/>
+          <w:b/>
+          <w:bCs/>
+          <w:color w:val="2F5496" w:themeColor="accent1" w:themeShade="BF"/>
+          <w:sz w:val="36"/>
+          <w:szCs w:val="36"/>
+          <w:u w:val="single"/>
+        </w:rPr>
+      </w:pPr>
+    </w:p>
+    <w:p>
+      <w:pPr>
+        <w:pBdr>
+          <w:bottom w:val="single" w:sz="12" w:space="1" w:color="auto"/>
+        </w:pBdr>
+        <w:jc w:val="center"/>
+        <w:rPr>
+          <w:rFonts w:ascii="Times New Roman" w:hAnsi="Times New Roman" w:cs="Times New Roman"/>
+          <w:b/>
+          <w:bCs/>
+          <w:color w:val="2F5496" w:themeColor="accent1" w:themeShade="BF"/>
+          <w:sz w:val="36"/>
+          <w:szCs w:val="36"/>
+          <w:u w:val="single"/>
+        </w:rPr>
+      </w:pPr>
+      <w:r>
+        <w:rPr>
+          <w:rFonts w:ascii="Times New Roman" w:hAnsi="Times New Roman" w:cs="Times New Roman"/>
+          <w:b/>
+          <w:bCs/>
+          <w:color w:val="2F5496" w:themeColor="accent1" w:themeShade="BF"/>
+          <w:sz w:val="36"/>
+          <w:szCs w:val="36"/>
+          <w:u w:val="single"/>
+        </w:rPr>
+        <w:t>Table of Content</w:t>
+      </w:r>
+    </w:p>
+    <w:p>
+      <w:pPr>
+        <w:jc w:val="center"/>
+        <w:rPr>
+          <w:rFonts w:ascii="Times New Roman" w:hAnsi="Times New Roman" w:cs="Times New Roman"/>
+          <w:b/>
+          <w:bCs/>
+          <w:color w:val="2F5496" w:themeColor="accent1" w:themeShade="BF"/>
+          <w:sz w:val="36"/>
+          <w:szCs w:val="36"/>
+          <w:u w:val="single"/>
+        </w:rPr>
+      </w:pPr>
     </w:p>
     <w:tbl>
       <w:tblPr>
-        <w:tblStyle w:val="TableGrid"/>
+        <w:tblStyle w:val="GridTable4-Accent2"/>
         <w:tblW w:w="0" w:type="auto"/>
         <w:tblLook w:val="04A0" w:firstRow="1" w:lastRow="0" w:firstColumn="1" w:lastColumn="0" w:noHBand="0" w:noVBand="1"/>
       </w:tblPr>
       <w:tblGrid>
-        <w:gridCol w:w="1129"/>
-        <w:gridCol w:w="9065"/>
+        <w:gridCol w:w="1120"/>
+        <w:gridCol w:w="8508"/>
       </w:tblGrid>
       <w:tr>
-        <w:tc>
-          <w:tcPr>
+        <w:trPr>
+          <w:cnfStyle w:val="100000000000" w:firstRow="1" w:lastRow="0" w:firstColumn="0" w:lastColumn="0" w:oddVBand="0" w:evenVBand="0" w:oddHBand="0" w:evenHBand="0" w:firstRowFirstColumn="0" w:firstRowLastColumn="0" w:lastRowFirstColumn="0" w:lastRowLastColumn="0"/>
+        </w:trPr>
+        <w:tc>
+          <w:tcPr>
+            <w:cnfStyle w:val="001000000000" w:firstRow="0" w:lastRow="0" w:firstColumn="1" w:lastColumn="0" w:oddVBand="0" w:evenVBand="0" w:oddHBand="0" w:evenHBand="0" w:firstRowFirstColumn="0" w:firstRowLastColumn="0" w:lastRowFirstColumn="0" w:lastRowLastColumn="0"/>
             <w:tcW w:w="1129" w:type="dxa"/>
           </w:tcPr>
           <w:p>
             <w:pPr>
               <w:rPr>
                 <w:rFonts w:ascii="Times New Roman" w:hAnsi="Times New Roman" w:cs="Times New Roman"/>
-                <w:b/>
-                <w:bCs/>
+                <w:b w:val="0"/>
+                <w:bCs w:val="0"/>
                 <w:sz w:val="36"/>
                 <w:szCs w:val="36"/>
               </w:rPr>
@@ -182,8 +412,6 @@
             <w:r>
               <w:rPr>
                 <w:rFonts w:ascii="Times New Roman" w:hAnsi="Times New Roman" w:cs="Times New Roman"/>
-                <w:b/>
-                <w:bCs/>
                 <w:sz w:val="36"/>
                 <w:szCs w:val="36"/>
               </w:rPr>
@@ -197,10 +425,11 @@
           </w:tcPr>
           <w:p>
             <w:pPr>
+              <w:cnfStyle w:val="100000000000" w:firstRow="1" w:lastRow="0" w:firstColumn="0" w:lastColumn="0" w:oddVBand="0" w:evenVBand="0" w:oddHBand="0" w:evenHBand="0" w:firstRowFirstColumn="0" w:firstRowLastColumn="0" w:lastRowFirstColumn="0" w:lastRowLastColumn="0"/>
               <w:rPr>
                 <w:rFonts w:ascii="Times New Roman" w:hAnsi="Times New Roman" w:cs="Times New Roman"/>
-                <w:b/>
-                <w:bCs/>
+                <w:b w:val="0"/>
+                <w:bCs w:val="0"/>
                 <w:sz w:val="36"/>
                 <w:szCs w:val="36"/>
               </w:rPr>
@@ -208,8 +437,6 @@
             <w:r>
               <w:rPr>
                 <w:rFonts w:ascii="Times New Roman" w:hAnsi="Times New Roman" w:cs="Times New Roman"/>
-                <w:b/>
-                <w:bCs/>
                 <w:sz w:val="36"/>
                 <w:szCs w:val="36"/>
               </w:rPr>
@@ -219,16 +446,20 @@
         </w:tc>
       </w:tr>
       <w:tr>
-        <w:tc>
-          <w:tcPr>
+        <w:trPr>
+          <w:cnfStyle w:val="000000100000" w:firstRow="0" w:lastRow="0" w:firstColumn="0" w:lastColumn="0" w:oddVBand="0" w:evenVBand="0" w:oddHBand="1" w:evenHBand="0" w:firstRowFirstColumn="0" w:firstRowLastColumn="0" w:lastRowFirstColumn="0" w:lastRowLastColumn="0"/>
+        </w:trPr>
+        <w:tc>
+          <w:tcPr>
+            <w:cnfStyle w:val="001000000000" w:firstRow="0" w:lastRow="0" w:firstColumn="1" w:lastColumn="0" w:oddVBand="0" w:evenVBand="0" w:oddHBand="0" w:evenHBand="0" w:firstRowFirstColumn="0" w:firstRowLastColumn="0" w:lastRowFirstColumn="0" w:lastRowLastColumn="0"/>
             <w:tcW w:w="1129" w:type="dxa"/>
           </w:tcPr>
           <w:p>
             <w:pPr>
               <w:rPr>
                 <w:rFonts w:ascii="Times New Roman" w:hAnsi="Times New Roman" w:cs="Times New Roman"/>
-                <w:b/>
-                <w:bCs/>
+                <w:b w:val="0"/>
+                <w:bCs w:val="0"/>
                 <w:sz w:val="36"/>
                 <w:szCs w:val="36"/>
               </w:rPr>
@@ -236,8 +467,6 @@
             <w:r>
               <w:rPr>
                 <w:rFonts w:ascii="Times New Roman" w:hAnsi="Times New Roman" w:cs="Times New Roman"/>
-                <w:b/>
-                <w:bCs/>
                 <w:sz w:val="36"/>
                 <w:szCs w:val="36"/>
               </w:rPr>
@@ -251,6 +480,7 @@
           </w:tcPr>
           <w:p>
             <w:pPr>
+              <w:cnfStyle w:val="000000100000" w:firstRow="0" w:lastRow="0" w:firstColumn="0" w:lastColumn="0" w:oddVBand="0" w:evenVBand="0" w:oddHBand="1" w:evenHBand="0" w:firstRowFirstColumn="0" w:firstRowLastColumn="0" w:lastRowFirstColumn="0" w:lastRowLastColumn="0"/>
               <w:rPr>
                 <w:rFonts w:ascii="Times New Roman" w:hAnsi="Times New Roman" w:cs="Times New Roman"/>
                 <w:b/>
@@ -275,14 +505,15 @@
       <w:tr>
         <w:tc>
           <w:tcPr>
+            <w:cnfStyle w:val="001000000000" w:firstRow="0" w:lastRow="0" w:firstColumn="1" w:lastColumn="0" w:oddVBand="0" w:evenVBand="0" w:oddHBand="0" w:evenHBand="0" w:firstRowFirstColumn="0" w:firstRowLastColumn="0" w:lastRowFirstColumn="0" w:lastRowLastColumn="0"/>
             <w:tcW w:w="1129" w:type="dxa"/>
           </w:tcPr>
           <w:p>
             <w:pPr>
               <w:rPr>
                 <w:rFonts w:ascii="Times New Roman" w:hAnsi="Times New Roman" w:cs="Times New Roman"/>
-                <w:b/>
-                <w:bCs/>
+                <w:b w:val="0"/>
+                <w:bCs w:val="0"/>
                 <w:sz w:val="36"/>
                 <w:szCs w:val="36"/>
               </w:rPr>
@@ -290,8 +521,6 @@
             <w:r>
               <w:rPr>
                 <w:rFonts w:ascii="Times New Roman" w:hAnsi="Times New Roman" w:cs="Times New Roman"/>
-                <w:b/>
-                <w:bCs/>
                 <w:sz w:val="36"/>
                 <w:szCs w:val="36"/>
               </w:rPr>
@@ -305,6 +534,7 @@
           </w:tcPr>
           <w:p>
             <w:pPr>
+              <w:cnfStyle w:val="000000000000" w:firstRow="0" w:lastRow="0" w:firstColumn="0" w:lastColumn="0" w:oddVBand="0" w:evenVBand="0" w:oddHBand="0" w:evenHBand="0" w:firstRowFirstColumn="0" w:firstRowLastColumn="0" w:lastRowFirstColumn="0" w:lastRowLastColumn="0"/>
               <w:rPr>
                 <w:rFonts w:ascii="Times New Roman" w:hAnsi="Times New Roman" w:cs="Times New Roman"/>
                 <w:b/>
@@ -327,16 +557,20 @@
         </w:tc>
       </w:tr>
       <w:tr>
-        <w:tc>
-          <w:tcPr>
+        <w:trPr>
+          <w:cnfStyle w:val="000000100000" w:firstRow="0" w:lastRow="0" w:firstColumn="0" w:lastColumn="0" w:oddVBand="0" w:evenVBand="0" w:oddHBand="1" w:evenHBand="0" w:firstRowFirstColumn="0" w:firstRowLastColumn="0" w:lastRowFirstColumn="0" w:lastRowLastColumn="0"/>
+        </w:trPr>
+        <w:tc>
+          <w:tcPr>
+            <w:cnfStyle w:val="001000000000" w:firstRow="0" w:lastRow="0" w:firstColumn="1" w:lastColumn="0" w:oddVBand="0" w:evenVBand="0" w:oddHBand="0" w:evenHBand="0" w:firstRowFirstColumn="0" w:firstRowLastColumn="0" w:lastRowFirstColumn="0" w:lastRowLastColumn="0"/>
             <w:tcW w:w="1129" w:type="dxa"/>
           </w:tcPr>
           <w:p>
             <w:pPr>
               <w:rPr>
                 <w:rFonts w:ascii="Times New Roman" w:hAnsi="Times New Roman" w:cs="Times New Roman"/>
-                <w:b/>
-                <w:bCs/>
+                <w:b w:val="0"/>
+                <w:bCs w:val="0"/>
                 <w:sz w:val="36"/>
                 <w:szCs w:val="36"/>
               </w:rPr>
@@ -344,8 +578,6 @@
             <w:r>
               <w:rPr>
                 <w:rFonts w:ascii="Times New Roman" w:hAnsi="Times New Roman" w:cs="Times New Roman"/>
-                <w:b/>
-                <w:bCs/>
                 <w:sz w:val="36"/>
                 <w:szCs w:val="36"/>
               </w:rPr>
@@ -359,6 +591,7 @@
           </w:tcPr>
           <w:p>
             <w:pPr>
+              <w:cnfStyle w:val="000000100000" w:firstRow="0" w:lastRow="0" w:firstColumn="0" w:lastColumn="0" w:oddVBand="0" w:evenVBand="0" w:oddHBand="1" w:evenHBand="0" w:firstRowFirstColumn="0" w:firstRowLastColumn="0" w:lastRowFirstColumn="0" w:lastRowLastColumn="0"/>
               <w:rPr>
                 <w:rFonts w:ascii="Times New Roman" w:hAnsi="Times New Roman" w:cs="Times New Roman"/>
                 <w:b/>
@@ -383,14 +616,15 @@
       <w:tr>
         <w:tc>
           <w:tcPr>
+            <w:cnfStyle w:val="001000000000" w:firstRow="0" w:lastRow="0" w:firstColumn="1" w:lastColumn="0" w:oddVBand="0" w:evenVBand="0" w:oddHBand="0" w:evenHBand="0" w:firstRowFirstColumn="0" w:firstRowLastColumn="0" w:lastRowFirstColumn="0" w:lastRowLastColumn="0"/>
             <w:tcW w:w="1129" w:type="dxa"/>
           </w:tcPr>
           <w:p>
             <w:pPr>
               <w:rPr>
                 <w:rFonts w:ascii="Times New Roman" w:hAnsi="Times New Roman" w:cs="Times New Roman"/>
-                <w:b/>
-                <w:bCs/>
+                <w:b w:val="0"/>
+                <w:bCs w:val="0"/>
                 <w:sz w:val="36"/>
                 <w:szCs w:val="36"/>
               </w:rPr>
@@ -398,8 +632,6 @@
             <w:r>
               <w:rPr>
                 <w:rFonts w:ascii="Times New Roman" w:hAnsi="Times New Roman" w:cs="Times New Roman"/>
-                <w:b/>
-                <w:bCs/>
                 <w:sz w:val="36"/>
                 <w:szCs w:val="36"/>
               </w:rPr>
@@ -413,6 +645,7 @@
           </w:tcPr>
           <w:p>
             <w:pPr>
+              <w:cnfStyle w:val="000000000000" w:firstRow="0" w:lastRow="0" w:firstColumn="0" w:lastColumn="0" w:oddVBand="0" w:evenVBand="0" w:oddHBand="0" w:evenHBand="0" w:firstRowFirstColumn="0" w:firstRowLastColumn="0" w:lastRowFirstColumn="0" w:lastRowLastColumn="0"/>
               <w:rPr>
                 <w:rFonts w:ascii="Times New Roman" w:hAnsi="Times New Roman" w:cs="Times New Roman"/>
                 <w:b/>
@@ -435,16 +668,20 @@
         </w:tc>
       </w:tr>
       <w:tr>
-        <w:tc>
-          <w:tcPr>
+        <w:trPr>
+          <w:cnfStyle w:val="000000100000" w:firstRow="0" w:lastRow="0" w:firstColumn="0" w:lastColumn="0" w:oddVBand="0" w:evenVBand="0" w:oddHBand="1" w:evenHBand="0" w:firstRowFirstColumn="0" w:firstRowLastColumn="0" w:lastRowFirstColumn="0" w:lastRowLastColumn="0"/>
+        </w:trPr>
+        <w:tc>
+          <w:tcPr>
+            <w:cnfStyle w:val="001000000000" w:firstRow="0" w:lastRow="0" w:firstColumn="1" w:lastColumn="0" w:oddVBand="0" w:evenVBand="0" w:oddHBand="0" w:evenHBand="0" w:firstRowFirstColumn="0" w:firstRowLastColumn="0" w:lastRowFirstColumn="0" w:lastRowLastColumn="0"/>
             <w:tcW w:w="1129" w:type="dxa"/>
           </w:tcPr>
           <w:p>
             <w:pPr>
               <w:rPr>
                 <w:rFonts w:ascii="Times New Roman" w:hAnsi="Times New Roman" w:cs="Times New Roman"/>
-                <w:b/>
-                <w:bCs/>
+                <w:b w:val="0"/>
+                <w:bCs w:val="0"/>
                 <w:sz w:val="36"/>
                 <w:szCs w:val="36"/>
               </w:rPr>
@@ -452,8 +689,6 @@
             <w:r>
               <w:rPr>
                 <w:rFonts w:ascii="Times New Roman" w:hAnsi="Times New Roman" w:cs="Times New Roman"/>
-                <w:b/>
-                <w:bCs/>
                 <w:sz w:val="36"/>
                 <w:szCs w:val="36"/>
               </w:rPr>
@@ -467,6 +702,7 @@
           </w:tcPr>
           <w:p>
             <w:pPr>
+              <w:cnfStyle w:val="000000100000" w:firstRow="0" w:lastRow="0" w:firstColumn="0" w:lastColumn="0" w:oddVBand="0" w:evenVBand="0" w:oddHBand="1" w:evenHBand="0" w:firstRowFirstColumn="0" w:firstRowLastColumn="0" w:lastRowFirstColumn="0" w:lastRowLastColumn="0"/>
               <w:rPr>
                 <w:rFonts w:ascii="Times New Roman" w:hAnsi="Times New Roman" w:cs="Times New Roman"/>
                 <w:b/>
@@ -491,14 +727,15 @@
       <w:tr>
         <w:tc>
           <w:tcPr>
+            <w:cnfStyle w:val="001000000000" w:firstRow="0" w:lastRow="0" w:firstColumn="1" w:lastColumn="0" w:oddVBand="0" w:evenVBand="0" w:oddHBand="0" w:evenHBand="0" w:firstRowFirstColumn="0" w:firstRowLastColumn="0" w:lastRowFirstColumn="0" w:lastRowLastColumn="0"/>
             <w:tcW w:w="1129" w:type="dxa"/>
           </w:tcPr>
           <w:p>
             <w:pPr>
               <w:rPr>
                 <w:rFonts w:ascii="Times New Roman" w:hAnsi="Times New Roman" w:cs="Times New Roman"/>
-                <w:b/>
-                <w:bCs/>
+                <w:b w:val="0"/>
+                <w:bCs w:val="0"/>
                 <w:sz w:val="36"/>
                 <w:szCs w:val="36"/>
               </w:rPr>
@@ -506,8 +743,6 @@
             <w:r>
               <w:rPr>
                 <w:rFonts w:ascii="Times New Roman" w:hAnsi="Times New Roman" w:cs="Times New Roman"/>
-                <w:b/>
-                <w:bCs/>
                 <w:sz w:val="36"/>
                 <w:szCs w:val="36"/>
               </w:rPr>
@@ -521,6 +756,7 @@
           </w:tcPr>
           <w:p>
             <w:pPr>
+              <w:cnfStyle w:val="000000000000" w:firstRow="0" w:lastRow="0" w:firstColumn="0" w:lastColumn="0" w:oddVBand="0" w:evenVBand="0" w:oddHBand="0" w:evenHBand="0" w:firstRowFirstColumn="0" w:firstRowLastColumn="0" w:lastRowFirstColumn="0" w:lastRowLastColumn="0"/>
               <w:rPr>
                 <w:rFonts w:ascii="Times New Roman" w:hAnsi="Times New Roman" w:cs="Times New Roman"/>
                 <w:b/>
@@ -543,16 +779,20 @@
         </w:tc>
       </w:tr>
       <w:tr>
-        <w:tc>
-          <w:tcPr>
+        <w:trPr>
+          <w:cnfStyle w:val="000000100000" w:firstRow="0" w:lastRow="0" w:firstColumn="0" w:lastColumn="0" w:oddVBand="0" w:evenVBand="0" w:oddHBand="1" w:evenHBand="0" w:firstRowFirstColumn="0" w:firstRowLastColumn="0" w:lastRowFirstColumn="0" w:lastRowLastColumn="0"/>
+        </w:trPr>
+        <w:tc>
+          <w:tcPr>
+            <w:cnfStyle w:val="001000000000" w:firstRow="0" w:lastRow="0" w:firstColumn="1" w:lastColumn="0" w:oddVBand="0" w:evenVBand="0" w:oddHBand="0" w:evenHBand="0" w:firstRowFirstColumn="0" w:firstRowLastColumn="0" w:lastRowFirstColumn="0" w:lastRowLastColumn="0"/>
             <w:tcW w:w="1129" w:type="dxa"/>
           </w:tcPr>
           <w:p>
             <w:pPr>
               <w:rPr>
                 <w:rFonts w:ascii="Times New Roman" w:hAnsi="Times New Roman" w:cs="Times New Roman"/>
-                <w:b/>
-                <w:bCs/>
+                <w:b w:val="0"/>
+                <w:bCs w:val="0"/>
                 <w:sz w:val="36"/>
                 <w:szCs w:val="36"/>
               </w:rPr>
@@ -560,8 +800,6 @@
             <w:r>
               <w:rPr>
                 <w:rFonts w:ascii="Times New Roman" w:hAnsi="Times New Roman" w:cs="Times New Roman"/>
-                <w:b/>
-                <w:bCs/>
                 <w:sz w:val="36"/>
                 <w:szCs w:val="36"/>
               </w:rPr>
@@ -575,6 +813,7 @@
           </w:tcPr>
           <w:p>
             <w:pPr>
+              <w:cnfStyle w:val="000000100000" w:firstRow="0" w:lastRow="0" w:firstColumn="0" w:lastColumn="0" w:oddVBand="0" w:evenVBand="0" w:oddHBand="1" w:evenHBand="0" w:firstRowFirstColumn="0" w:firstRowLastColumn="0" w:lastRowFirstColumn="0" w:lastRowLastColumn="0"/>
               <w:rPr>
                 <w:rFonts w:ascii="Times New Roman" w:hAnsi="Times New Roman" w:cs="Times New Roman"/>
                 <w:b/>
@@ -599,14 +838,15 @@
       <w:tr>
         <w:tc>
           <w:tcPr>
+            <w:cnfStyle w:val="001000000000" w:firstRow="0" w:lastRow="0" w:firstColumn="1" w:lastColumn="0" w:oddVBand="0" w:evenVBand="0" w:oddHBand="0" w:evenHBand="0" w:firstRowFirstColumn="0" w:firstRowLastColumn="0" w:lastRowFirstColumn="0" w:lastRowLastColumn="0"/>
             <w:tcW w:w="1129" w:type="dxa"/>
           </w:tcPr>
           <w:p>
             <w:pPr>
               <w:rPr>
                 <w:rFonts w:ascii="Times New Roman" w:hAnsi="Times New Roman" w:cs="Times New Roman"/>
-                <w:b/>
-                <w:bCs/>
+                <w:b w:val="0"/>
+                <w:bCs w:val="0"/>
                 <w:sz w:val="36"/>
                 <w:szCs w:val="36"/>
               </w:rPr>
@@ -614,8 +854,6 @@
             <w:r>
               <w:rPr>
                 <w:rFonts w:ascii="Times New Roman" w:hAnsi="Times New Roman" w:cs="Times New Roman"/>
-                <w:b/>
-                <w:bCs/>
                 <w:sz w:val="36"/>
                 <w:szCs w:val="36"/>
               </w:rPr>
@@ -629,6 +867,7 @@
           </w:tcPr>
           <w:p>
             <w:pPr>
+              <w:cnfStyle w:val="000000000000" w:firstRow="0" w:lastRow="0" w:firstColumn="0" w:lastColumn="0" w:oddVBand="0" w:evenVBand="0" w:oddHBand="0" w:evenHBand="0" w:firstRowFirstColumn="0" w:firstRowLastColumn="0" w:lastRowFirstColumn="0" w:lastRowLastColumn="0"/>
               <w:rPr>
                 <w:rFonts w:ascii="Times New Roman" w:hAnsi="Times New Roman" w:cs="Times New Roman"/>
                 <w:b/>
@@ -674,6 +913,7 @@
     </w:p>
     <w:p>
       <w:pPr>
+        <w:spacing w:line="180" w:lineRule="auto"/>
         <w:rPr>
           <w:rFonts w:ascii="Times New Roman" w:hAnsi="Times New Roman" w:cs="Times New Roman"/>
           <w:b/>
@@ -685,54 +925,97 @@
     </w:p>
     <w:p>
       <w:pPr>
-        <w:rPr>
-          <w:rFonts w:ascii="Times New Roman" w:hAnsi="Times New Roman" w:cs="Times New Roman"/>
+        <w:pBdr>
+          <w:bottom w:val="single" w:sz="12" w:space="1" w:color="auto"/>
+        </w:pBdr>
+        <w:spacing w:line="180" w:lineRule="auto"/>
+      </w:pPr>
+      <w:r>
+        <w:rPr>
+          <w:color w:val="2F5496" w:themeColor="accent1" w:themeShade="BF"/>
+          <w:sz w:val="36"/>
+          <w:szCs w:val="36"/>
+        </w:rPr>
+        <w:t>Project Overview</w:t>
+      </w:r>
+      <w:r>
+        <w:rPr>
+          <w:color w:val="2F5496" w:themeColor="accent1" w:themeShade="BF"/>
+        </w:rPr>
+        <w:t xml:space="preserve"> </w:t>
+      </w:r>
+    </w:p>
+    <w:p>
+      <w:pPr>
+        <w:spacing w:line="180" w:lineRule="auto"/>
+      </w:pPr>
+      <w:r>
+        <w:br/>
+      </w:r>
+      <w:proofErr w:type="spellStart"/>
+      <w:r>
+        <w:t>RetailEasy</w:t>
+      </w:r>
+      <w:proofErr w:type="spellEnd"/>
+      <w:r>
+        <w:t xml:space="preserve"> </w:t>
+      </w:r>
+      <w:proofErr w:type="spellStart"/>
+      <w:r>
+        <w:t>Pvt.</w:t>
+      </w:r>
+      <w:proofErr w:type="spellEnd"/>
+      <w:r>
+        <w:t xml:space="preserve"> Ltd. is a fast-growing Indian e-commerce company founded in Pune, Maharashtra. Initially established as a small fashion reseller, the company has expanded its operations across Maharashtra and Karnataka through its website and mobile application. </w:t>
+      </w:r>
+      <w:proofErr w:type="spellStart"/>
+      <w:r>
+        <w:t>RetailEasy</w:t>
+      </w:r>
+      <w:proofErr w:type="spellEnd"/>
+      <w:r>
+        <w:t xml:space="preserve"> currently sells clothing, footwear, and consumer electronics to a rapidly growing customer base.</w:t>
+      </w:r>
+    </w:p>
+    <w:p>
+      <w:pPr>
+        <w:spacing w:line="180" w:lineRule="auto"/>
+      </w:pPr>
+      <w:r>
+        <w:t>The company processes approximately 600–700 orders daily and operates with a customer support team of 12 agents. Its current technology ecosystem includes Gmail for communication, WhatsApp for internal coordination, Google Sheets for tracking operations, and Zoho CRM for maintaining customer records. The development team consists of 6 engineers responsible for managing and enhancing the existing systems.</w:t>
+      </w:r>
+    </w:p>
+    <w:p>
+      <w:pPr>
+        <w:spacing w:line="180" w:lineRule="auto"/>
+      </w:pPr>
+      <w:r>
+        <w:t>As order volumes increased significantly, the company’s returns management process failed to scale effectively. The existing return process is highly manual, time-consuming, and dependent on disconnected tools, resulting in operational inefficiencies. This has led to increased customer dissatisfaction, reduced agent productivity, delayed refund processing, and revenue loss for the company.</w:t>
+      </w:r>
+    </w:p>
+    <w:p>
+      <w:pPr>
+        <w:pBdr>
+          <w:bottom w:val="single" w:sz="12" w:space="1" w:color="auto"/>
+        </w:pBdr>
+        <w:spacing w:line="180" w:lineRule="auto"/>
+        <w:rPr>
           <w:b/>
           <w:bCs/>
+          <w:color w:val="2F5496" w:themeColor="accent1" w:themeShade="BF"/>
           <w:sz w:val="36"/>
           <w:szCs w:val="36"/>
         </w:rPr>
       </w:pPr>
-    </w:p>
-    <w:p>
-      <w:pPr>
-        <w:rPr>
-          <w:rFonts w:ascii="Times New Roman" w:hAnsi="Times New Roman" w:cs="Times New Roman"/>
+      <w:r>
+        <w:rPr>
           <w:b/>
           <w:bCs/>
+          <w:color w:val="2F5496" w:themeColor="accent1" w:themeShade="BF"/>
           <w:sz w:val="36"/>
           <w:szCs w:val="36"/>
         </w:rPr>
-      </w:pPr>
-    </w:p>
-    <w:p>
-      <w:pPr>
-        <w:spacing w:line="180" w:lineRule="auto"/>
-      </w:pPr>
-      <w:r>
-        <w:t xml:space="preserve">Project Overview : </w:t>
-      </w:r>
-      <w:r>
-        <w:br/>
-      </w:r>
-      <w:r>
-        <w:t>RetailEasy Pvt. Ltd. is a fast-growing Indian e-commerce company founded in Pune, Maharashtra. Initially established as a small fashion reseller, the company has expanded its operations across Maharashtra and Karnataka through its website and mobile application. RetailEasy currently sells clothing, footwear, and consumer electronics to a rapidly growing customer base.</w:t>
-      </w:r>
-    </w:p>
-    <w:p>
-      <w:pPr>
-        <w:spacing w:line="180" w:lineRule="auto"/>
-      </w:pPr>
-      <w:r>
-        <w:t>The company processes approximately 600–700 orders daily and operates with a customer support team of 12 agents. Its current technology ecosystem includes Gmail for communication, WhatsApp for internal coordination, Google Sheets for tracking operations, and Zoho CRM for maintaining customer records. The development team consists of 6 engineers responsible for managing and enhancing the existing systems.</w:t>
-      </w:r>
-    </w:p>
-    <w:p>
-      <w:pPr>
-        <w:spacing w:line="180" w:lineRule="auto"/>
-      </w:pPr>
-      <w:r>
-        <w:t>As order volumes increased significantly, the company’s returns management process failed to scale effectively. The existing return process is highly manual, time-consuming, and dependent on disconnected tools, resulting in operational inefficiencies. This has led to increased customer dissatisfaction, reduced agent productivity, delayed refund processing, and revenue loss for the company.</w:t>
+        <w:t>Business Problem Statement</w:t>
       </w:r>
     </w:p>
     <w:p>
@@ -741,22 +1024,26 @@
         <w:rPr>
           <w:b/>
           <w:bCs/>
-        </w:rPr>
-      </w:pPr>
-      <w:r>
-        <w:rPr>
-          <w:b/>
-          <w:bCs/>
-        </w:rPr>
-        <w:t>Business Problem Statement</w:t>
-      </w:r>
-    </w:p>
-    <w:p>
-      <w:pPr>
-        <w:spacing w:line="180" w:lineRule="auto"/>
-      </w:pPr>
-      <w:r>
-        <w:t>Currently, RetailEasy manages product return requests manually through email communication. Customers initiate return requests by sending emails to the support team. These emails are reviewed by customer service agents either on the same day or the following day. In many cases, agents must request additional information such as the order ID, product images, and reason for return, which further delays the process as customers often respond a day later.</w:t>
+          <w:color w:val="2F5496" w:themeColor="accent1" w:themeShade="BF"/>
+          <w:sz w:val="36"/>
+          <w:szCs w:val="36"/>
+        </w:rPr>
+      </w:pPr>
+    </w:p>
+    <w:p>
+      <w:pPr>
+        <w:spacing w:line="180" w:lineRule="auto"/>
+      </w:pPr>
+      <w:r>
+        <w:t xml:space="preserve">Currently, </w:t>
+      </w:r>
+      <w:proofErr w:type="spellStart"/>
+      <w:r>
+        <w:t>RetailEasy</w:t>
+      </w:r>
+      <w:proofErr w:type="spellEnd"/>
+      <w:r>
+        <w:t xml:space="preserve"> manages product return requests manually through email communication. Customers initiate return requests by sending emails to the support team. These emails are reviewed by customer service agents either on the same day or the following day. In many cases, agents must request additional information such as the order ID, product images, and reason for return, which further delays the process as customers often respond a day later.</w:t>
       </w:r>
     </w:p>
     <w:p>
@@ -852,7 +1139,15 @@
         <w:spacing w:line="180" w:lineRule="auto"/>
       </w:pPr>
       <w:r>
-        <w:t xml:space="preserve">Return-related data is not captured properly, limiting the company’s ability to analyze trends and improve operations. </w:t>
+        <w:t xml:space="preserve">Return-related data is not captured properly, limiting the company’s ability to </w:t>
+      </w:r>
+      <w:proofErr w:type="spellStart"/>
+      <w:r>
+        <w:t>analyze</w:t>
+      </w:r>
+      <w:proofErr w:type="spellEnd"/>
+      <w:r>
+        <w:t xml:space="preserve"> trends and improve operations. </w:t>
       </w:r>
     </w:p>
     <w:p>
@@ -894,17 +1189,38 @@
           <w14:ligatures w14:val="none"/>
         </w:rPr>
       </w:pPr>
-      <w:r>
+    </w:p>
+    <w:p>
+      <w:pPr>
+        <w:pBdr>
+          <w:bottom w:val="single" w:sz="12" w:space="1" w:color="auto"/>
+        </w:pBdr>
+        <w:spacing w:before="100" w:beforeAutospacing="1" w:after="100" w:afterAutospacing="1" w:line="240" w:lineRule="auto"/>
+        <w:outlineLvl w:val="1"/>
         <w:rPr>
           <w:rFonts w:ascii="Times New Roman" w:eastAsia="Times New Roman" w:hAnsi="Times New Roman" w:cs="Times New Roman"/>
           <w:b/>
           <w:bCs/>
+          <w:color w:val="2F5496" w:themeColor="accent1" w:themeShade="BF"/>
           <w:kern w:val="0"/>
           <w:sz w:val="36"/>
           <w:szCs w:val="36"/>
           <w:lang w:eastAsia="ja-JP" w:bidi="mr-IN"/>
           <w14:ligatures w14:val="none"/>
         </w:rPr>
+      </w:pPr>
+      <w:r>
+        <w:rPr>
+          <w:rFonts w:ascii="Times New Roman" w:eastAsia="Times New Roman" w:hAnsi="Times New Roman" w:cs="Times New Roman"/>
+          <w:b/>
+          <w:bCs/>
+          <w:color w:val="2F5496" w:themeColor="accent1" w:themeShade="BF"/>
+          <w:kern w:val="0"/>
+          <w:sz w:val="36"/>
+          <w:szCs w:val="36"/>
+          <w:lang w:eastAsia="ja-JP" w:bidi="mr-IN"/>
+          <w14:ligatures w14:val="none"/>
+        </w:rPr>
         <w:t>Business Objective</w:t>
       </w:r>
     </w:p>
@@ -925,20 +1241,19 @@
           <w:lang w:eastAsia="ja-JP" w:bidi="mr-IN"/>
           <w14:ligatures w14:val="none"/>
         </w:rPr>
-        <w:lastRenderedPageBreak/>
-        <w:t>The primary objective of this project is to design and implement an automated returns and refund management system for RetailEasy Pvt. Ltd. The proposed solution aims to streamline the complete return lifecycle, from return request initiation to refund processing and status updates.</w:t>
-      </w:r>
-    </w:p>
-    <w:p>
-      <w:pPr>
-        <w:spacing w:before="100" w:beforeAutospacing="1" w:after="100" w:afterAutospacing="1" w:line="240" w:lineRule="auto"/>
+        <w:t xml:space="preserve">The primary objective of this project is to design and implement an automated returns and refund management system for </w:t>
+      </w:r>
+      <w:proofErr w:type="spellStart"/>
+      <w:r>
         <w:rPr>
           <w:rFonts w:ascii="Times New Roman" w:eastAsia="Times New Roman" w:hAnsi="Times New Roman" w:cs="Times New Roman"/>
           <w:kern w:val="0"/>
           <w:lang w:eastAsia="ja-JP" w:bidi="mr-IN"/>
           <w14:ligatures w14:val="none"/>
         </w:rPr>
-      </w:pPr>
+        <w:t>RetailEasy</w:t>
+      </w:r>
+      <w:proofErr w:type="spellEnd"/>
       <w:r>
         <w:rPr>
           <w:rFonts w:ascii="Times New Roman" w:eastAsia="Times New Roman" w:hAnsi="Times New Roman" w:cs="Times New Roman"/>
@@ -946,19 +1261,19 @@
           <w:lang w:eastAsia="ja-JP" w:bidi="mr-IN"/>
           <w14:ligatures w14:val="none"/>
         </w:rPr>
-        <w:t>The system will automate key activities such as return request validation, order eligibility verification based on the 7-day return policy, refund initiation, and customer status tracking. The solution is expected to reduce manual effort, improve operational efficiency, and provide better visibility into the returns process.</w:t>
-      </w:r>
-    </w:p>
-    <w:p>
-      <w:pPr>
-        <w:spacing w:before="100" w:beforeAutospacing="1" w:after="100" w:afterAutospacing="1" w:line="240" w:lineRule="auto"/>
+        <w:t xml:space="preserve"> </w:t>
+      </w:r>
+      <w:proofErr w:type="spellStart"/>
+      <w:r>
         <w:rPr>
           <w:rFonts w:ascii="Times New Roman" w:eastAsia="Times New Roman" w:hAnsi="Times New Roman" w:cs="Times New Roman"/>
           <w:kern w:val="0"/>
           <w:lang w:eastAsia="ja-JP" w:bidi="mr-IN"/>
           <w14:ligatures w14:val="none"/>
         </w:rPr>
-      </w:pPr>
+        <w:t>Pvt.</w:t>
+      </w:r>
+      <w:proofErr w:type="spellEnd"/>
       <w:r>
         <w:rPr>
           <w:rFonts w:ascii="Times New Roman" w:eastAsia="Times New Roman" w:hAnsi="Times New Roman" w:cs="Times New Roman"/>
@@ -966,15 +1281,11 @@
           <w:lang w:eastAsia="ja-JP" w:bidi="mr-IN"/>
           <w14:ligatures w14:val="none"/>
         </w:rPr>
-        <w:t>The key business objectives are:</w:t>
-      </w:r>
-    </w:p>
-    <w:p>
-      <w:pPr>
-        <w:numPr>
-          <w:ilvl w:val="0"/>
-          <w:numId w:val="3"/>
-        </w:numPr>
+        <w:t xml:space="preserve"> Ltd. The proposed solution aims to streamline the complete return lifecycle, from return request initiation to refund processing and status updates.</w:t>
+      </w:r>
+    </w:p>
+    <w:p>
+      <w:pPr>
         <w:spacing w:before="100" w:beforeAutospacing="1" w:after="100" w:afterAutospacing="1" w:line="240" w:lineRule="auto"/>
         <w:rPr>
           <w:rFonts w:ascii="Times New Roman" w:eastAsia="Times New Roman" w:hAnsi="Times New Roman" w:cs="Times New Roman"/>
@@ -990,14 +1301,39 @@
           <w:lang w:eastAsia="ja-JP" w:bidi="mr-IN"/>
           <w14:ligatures w14:val="none"/>
         </w:rPr>
-        <w:t xml:space="preserve">Automate the end-to-end returns and refund process </w:t>
-      </w:r>
-    </w:p>
-    <w:p>
-      <w:pPr>
+        <w:t>The system will automate key activities such as return request validation, order eligibility verification based on the 7-day return policy, refund initiation, and customer status tracking. The solution is expected to reduce manual effort, improve operational efficiency, and provide better visibility into the returns process.</w:t>
+      </w:r>
+    </w:p>
+    <w:p>
+      <w:pPr>
+        <w:spacing w:before="100" w:beforeAutospacing="1" w:after="100" w:afterAutospacing="1" w:line="240" w:lineRule="auto"/>
+        <w:rPr>
+          <w:rFonts w:ascii="Times New Roman" w:eastAsia="Times New Roman" w:hAnsi="Times New Roman" w:cs="Times New Roman"/>
+          <w:b/>
+          <w:bCs/>
+          <w:kern w:val="0"/>
+          <w:lang w:eastAsia="ja-JP" w:bidi="mr-IN"/>
+          <w14:ligatures w14:val="none"/>
+        </w:rPr>
+      </w:pPr>
+      <w:r>
+        <w:rPr>
+          <w:rFonts w:ascii="Times New Roman" w:eastAsia="Times New Roman" w:hAnsi="Times New Roman" w:cs="Times New Roman"/>
+          <w:b/>
+          <w:bCs/>
+          <w:kern w:val="0"/>
+          <w:lang w:eastAsia="ja-JP" w:bidi="mr-IN"/>
+          <w14:ligatures w14:val="none"/>
+        </w:rPr>
+        <w:t>The key business objectives are:</w:t>
+      </w:r>
+    </w:p>
+    <w:p>
+      <w:pPr>
+        <w:pStyle w:val="ListParagraph"/>
         <w:numPr>
           <w:ilvl w:val="0"/>
-          <w:numId w:val="3"/>
+          <w:numId w:val="8"/>
         </w:numPr>
         <w:spacing w:before="100" w:beforeAutospacing="1" w:after="100" w:afterAutospacing="1" w:line="240" w:lineRule="auto"/>
         <w:rPr>
@@ -1014,14 +1350,15 @@
           <w:lang w:eastAsia="ja-JP" w:bidi="mr-IN"/>
           <w14:ligatures w14:val="none"/>
         </w:rPr>
-        <w:t xml:space="preserve">Reduce manual dependency on emails, spreadsheets, and WhatsApp communication </w:t>
-      </w:r>
-    </w:p>
-    <w:p>
-      <w:pPr>
+        <w:t xml:space="preserve">Automate the end-to-end returns and refund process </w:t>
+      </w:r>
+    </w:p>
+    <w:p>
+      <w:pPr>
+        <w:pStyle w:val="ListParagraph"/>
         <w:numPr>
           <w:ilvl w:val="0"/>
-          <w:numId w:val="3"/>
+          <w:numId w:val="8"/>
         </w:numPr>
         <w:spacing w:before="100" w:beforeAutospacing="1" w:after="100" w:afterAutospacing="1" w:line="240" w:lineRule="auto"/>
         <w:rPr>
@@ -1038,14 +1375,15 @@
           <w:lang w:eastAsia="ja-JP" w:bidi="mr-IN"/>
           <w14:ligatures w14:val="none"/>
         </w:rPr>
-        <w:t xml:space="preserve">Minimize return resolution and refund processing time </w:t>
-      </w:r>
-    </w:p>
-    <w:p>
-      <w:pPr>
+        <w:t>Reduce manual dependency on emails, spreadsheets, and WhatsApp communication</w:t>
+      </w:r>
+    </w:p>
+    <w:p>
+      <w:pPr>
+        <w:pStyle w:val="ListParagraph"/>
         <w:numPr>
           <w:ilvl w:val="0"/>
-          <w:numId w:val="3"/>
+          <w:numId w:val="8"/>
         </w:numPr>
         <w:spacing w:before="100" w:beforeAutospacing="1" w:after="100" w:afterAutospacing="1" w:line="240" w:lineRule="auto"/>
         <w:rPr>
@@ -1062,14 +1400,15 @@
           <w:lang w:eastAsia="ja-JP" w:bidi="mr-IN"/>
           <w14:ligatures w14:val="none"/>
         </w:rPr>
-        <w:t xml:space="preserve">Improve customer satisfaction through faster and transparent service </w:t>
-      </w:r>
-    </w:p>
-    <w:p>
-      <w:pPr>
+        <w:t xml:space="preserve">Minimize return resolution and refund processing time </w:t>
+      </w:r>
+    </w:p>
+    <w:p>
+      <w:pPr>
+        <w:pStyle w:val="ListParagraph"/>
         <w:numPr>
           <w:ilvl w:val="0"/>
-          <w:numId w:val="3"/>
+          <w:numId w:val="8"/>
         </w:numPr>
         <w:spacing w:before="100" w:beforeAutospacing="1" w:after="100" w:afterAutospacing="1" w:line="240" w:lineRule="auto"/>
         <w:rPr>
@@ -1086,14 +1425,15 @@
           <w:lang w:eastAsia="ja-JP" w:bidi="mr-IN"/>
           <w14:ligatures w14:val="none"/>
         </w:rPr>
-        <w:t xml:space="preserve">Reduce duplicate refunds and operational errors </w:t>
-      </w:r>
-    </w:p>
-    <w:p>
-      <w:pPr>
+        <w:t xml:space="preserve">Improve customer satisfaction through faster and transparent service </w:t>
+      </w:r>
+    </w:p>
+    <w:p>
+      <w:pPr>
+        <w:pStyle w:val="ListParagraph"/>
         <w:numPr>
           <w:ilvl w:val="0"/>
-          <w:numId w:val="3"/>
+          <w:numId w:val="8"/>
         </w:numPr>
         <w:spacing w:before="100" w:beforeAutospacing="1" w:after="100" w:afterAutospacing="1" w:line="240" w:lineRule="auto"/>
         <w:rPr>
@@ -1110,14 +1450,15 @@
           <w:lang w:eastAsia="ja-JP" w:bidi="mr-IN"/>
           <w14:ligatures w14:val="none"/>
         </w:rPr>
-        <w:t xml:space="preserve">Improve coordination between customer support, warehouse, and finance teams </w:t>
-      </w:r>
-    </w:p>
-    <w:p>
-      <w:pPr>
+        <w:t xml:space="preserve">Reduce duplicate refunds and operational errors </w:t>
+      </w:r>
+    </w:p>
+    <w:p>
+      <w:pPr>
+        <w:pStyle w:val="ListParagraph"/>
         <w:numPr>
           <w:ilvl w:val="0"/>
-          <w:numId w:val="3"/>
+          <w:numId w:val="8"/>
         </w:numPr>
         <w:spacing w:before="100" w:beforeAutospacing="1" w:after="100" w:afterAutospacing="1" w:line="240" w:lineRule="auto"/>
         <w:rPr>
@@ -1134,14 +1475,15 @@
           <w:lang w:eastAsia="ja-JP" w:bidi="mr-IN"/>
           <w14:ligatures w14:val="none"/>
         </w:rPr>
-        <w:t xml:space="preserve">Capture return-related data for reporting and analytics </w:t>
-      </w:r>
-    </w:p>
-    <w:p>
-      <w:pPr>
+        <w:t xml:space="preserve">Improve coordination between customer support, warehouse, and finance teams </w:t>
+      </w:r>
+    </w:p>
+    <w:p>
+      <w:pPr>
+        <w:pStyle w:val="ListParagraph"/>
         <w:numPr>
           <w:ilvl w:val="0"/>
-          <w:numId w:val="3"/>
+          <w:numId w:val="8"/>
         </w:numPr>
         <w:spacing w:before="100" w:beforeAutospacing="1" w:after="100" w:afterAutospacing="1" w:line="240" w:lineRule="auto"/>
         <w:rPr>
@@ -1158,25 +1500,71 @@
           <w:lang w:eastAsia="ja-JP" w:bidi="mr-IN"/>
           <w14:ligatures w14:val="none"/>
         </w:rPr>
+        <w:t xml:space="preserve">Capture return-related data for reporting and analytics </w:t>
+      </w:r>
+    </w:p>
+    <w:p>
+      <w:pPr>
+        <w:pStyle w:val="ListParagraph"/>
+        <w:numPr>
+          <w:ilvl w:val="0"/>
+          <w:numId w:val="8"/>
+        </w:numPr>
+        <w:spacing w:before="100" w:beforeAutospacing="1" w:after="100" w:afterAutospacing="1" w:line="240" w:lineRule="auto"/>
+        <w:rPr>
+          <w:rFonts w:ascii="Times New Roman" w:eastAsia="Times New Roman" w:hAnsi="Times New Roman" w:cs="Times New Roman"/>
+          <w:kern w:val="0"/>
+          <w:lang w:eastAsia="ja-JP" w:bidi="mr-IN"/>
+          <w14:ligatures w14:val="none"/>
+        </w:rPr>
+      </w:pPr>
+      <w:r>
+        <w:rPr>
+          <w:rFonts w:ascii="Times New Roman" w:eastAsia="Times New Roman" w:hAnsi="Times New Roman" w:cs="Times New Roman"/>
+          <w:kern w:val="0"/>
+          <w:lang w:eastAsia="ja-JP" w:bidi="mr-IN"/>
+          <w14:ligatures w14:val="none"/>
+        </w:rPr>
         <w:t>Build a scalable process capable of handling increasing order volumes</w:t>
       </w:r>
     </w:p>
     <w:p>
       <w:pPr>
-        <w:spacing w:line="180" w:lineRule="auto"/>
-      </w:pPr>
-      <w:r>
-        <w:t>Scope:</w:t>
-      </w:r>
-      <w:r>
+        <w:pBdr>
+          <w:bottom w:val="single" w:sz="12" w:space="1" w:color="auto"/>
+        </w:pBdr>
+        <w:spacing w:line="180" w:lineRule="auto"/>
+      </w:pPr>
+      <w:r>
+        <w:rPr>
+          <w:color w:val="2F5496" w:themeColor="accent1" w:themeShade="BF"/>
+          <w:sz w:val="36"/>
+          <w:szCs w:val="36"/>
+        </w:rPr>
+        <w:t>Scope</w:t>
+      </w:r>
+    </w:p>
+    <w:p>
+      <w:pPr>
+        <w:spacing w:line="180" w:lineRule="auto"/>
+        <w:rPr>
+          <w:u w:val="single"/>
+        </w:rPr>
+      </w:pPr>
+      <w:r>
+        <w:rPr>
+          <w:u w:val="single"/>
+        </w:rPr>
         <w:br/>
       </w:r>
       <w:r>
         <w:rPr>
           <w:b/>
           <w:bCs/>
-        </w:rPr>
-        <w:t>5.1 In Scope</w:t>
+          <w:color w:val="2F5496" w:themeColor="accent1" w:themeShade="BF"/>
+          <w:u w:val="single"/>
+        </w:rPr>
+        <w:t>In Scope</w:t>
       </w:r>
     </w:p>
     <w:p>
@@ -1283,13 +1671,19 @@
     <w:p>
       <w:pPr>
         <w:spacing w:line="180" w:lineRule="auto"/>
+        <w:rPr>
+          <w:color w:val="2F5496" w:themeColor="accent1" w:themeShade="BF"/>
+          <w:u w:val="single"/>
+        </w:rPr>
       </w:pPr>
       <w:r>
         <w:rPr>
           <w:b/>
           <w:bCs/>
-        </w:rPr>
-        <w:t>5.2 Out of Scope</w:t>
+          <w:color w:val="2F5496" w:themeColor="accent1" w:themeShade="BF"/>
+          <w:u w:val="single"/>
+        </w:rPr>
+        <w:t>Out of Scope</w:t>
       </w:r>
     </w:p>
     <w:p>
@@ -1349,10 +1743,51 @@
     <w:p>
       <w:pPr>
         <w:spacing w:line="180" w:lineRule="auto"/>
-      </w:pPr>
-      <w:r>
-        <w:t>Stakeholder Summary:</w:t>
-      </w:r>
+        <w:ind w:left="500"/>
+      </w:pPr>
+    </w:p>
+    <w:p>
+      <w:pPr>
+        <w:spacing w:line="180" w:lineRule="auto"/>
+        <w:ind w:left="500"/>
+      </w:pPr>
+    </w:p>
+    <w:p>
+      <w:pPr>
+        <w:spacing w:line="180" w:lineRule="auto"/>
+        <w:ind w:left="500"/>
+      </w:pPr>
+    </w:p>
+    <w:p>
+      <w:pPr>
+        <w:pBdr>
+          <w:bottom w:val="single" w:sz="12" w:space="1" w:color="auto"/>
+        </w:pBdr>
+        <w:spacing w:line="180" w:lineRule="auto"/>
+        <w:rPr>
+          <w:color w:val="2F5496" w:themeColor="accent1" w:themeShade="BF"/>
+          <w:sz w:val="36"/>
+          <w:szCs w:val="36"/>
+        </w:rPr>
+      </w:pPr>
+      <w:r>
+        <w:rPr>
+          <w:color w:val="2F5496" w:themeColor="accent1" w:themeShade="BF"/>
+          <w:sz w:val="36"/>
+          <w:szCs w:val="36"/>
+        </w:rPr>
+        <w:t>Stakeholder Summary</w:t>
+      </w:r>
+    </w:p>
+    <w:p>
+      <w:pPr>
+        <w:spacing w:line="180" w:lineRule="auto"/>
+        <w:rPr>
+          <w:color w:val="2F5496" w:themeColor="accent1" w:themeShade="BF"/>
+          <w:sz w:val="36"/>
+          <w:szCs w:val="36"/>
+        </w:rPr>
+      </w:pPr>
     </w:p>
     <w:tbl>
       <w:tblPr>
@@ -1361,13 +1796,14 @@
         <w:tblLook w:val="04A0" w:firstRow="1" w:lastRow="0" w:firstColumn="1" w:lastColumn="0" w:noHBand="0" w:noVBand="1"/>
       </w:tblPr>
       <w:tblGrid>
-        <w:gridCol w:w="2649"/>
-        <w:gridCol w:w="2693"/>
-        <w:gridCol w:w="4772"/>
+        <w:gridCol w:w="2521"/>
+        <w:gridCol w:w="2566"/>
+        <w:gridCol w:w="4461"/>
       </w:tblGrid>
       <w:tr>
         <w:trPr>
           <w:cnfStyle w:val="100000000000" w:firstRow="1" w:lastRow="0" w:firstColumn="0" w:lastColumn="0" w:oddVBand="0" w:evenVBand="0" w:oddHBand="0" w:evenHBand="0" w:firstRowFirstColumn="0" w:firstRowLastColumn="0" w:lastRowFirstColumn="0" w:lastRowLastColumn="0"/>
+          <w:trHeight w:val="481"/>
         </w:trPr>
         <w:tc>
           <w:tcPr>
@@ -1713,8 +2149,13 @@
               <w:spacing w:line="180" w:lineRule="auto"/>
               <w:jc w:val="center"/>
             </w:pPr>
-            <w:r>
-              <w:t>RetailEasy | Customers</w:t>
+            <w:proofErr w:type="spellStart"/>
+            <w:r>
+              <w:t>RetailEasy</w:t>
+            </w:r>
+            <w:proofErr w:type="spellEnd"/>
+            <w:r>
+              <w:t xml:space="preserve"> | Customers</w:t>
             </w:r>
           </w:p>
         </w:tc>
@@ -1768,11 +2209,34 @@
     </w:p>
     <w:p>
       <w:pPr>
-        <w:spacing w:line="180" w:lineRule="auto"/>
-      </w:pPr>
-      <w:r>
-        <w:t>Success metric:</w:t>
-      </w:r>
+        <w:pBdr>
+          <w:bottom w:val="single" w:sz="12" w:space="1" w:color="auto"/>
+        </w:pBdr>
+        <w:spacing w:line="180" w:lineRule="auto"/>
+        <w:rPr>
+          <w:color w:val="2F5496" w:themeColor="accent1" w:themeShade="BF"/>
+          <w:sz w:val="36"/>
+          <w:szCs w:val="36"/>
+        </w:rPr>
+      </w:pPr>
+      <w:r>
+        <w:rPr>
+          <w:color w:val="2F5496" w:themeColor="accent1" w:themeShade="BF"/>
+          <w:sz w:val="36"/>
+          <w:szCs w:val="36"/>
+        </w:rPr>
+        <w:t>Success metric</w:t>
+      </w:r>
+    </w:p>
+    <w:p>
+      <w:pPr>
+        <w:spacing w:line="180" w:lineRule="auto"/>
+        <w:rPr>
+          <w:color w:val="2F5496" w:themeColor="accent1" w:themeShade="BF"/>
+          <w:sz w:val="36"/>
+          <w:szCs w:val="36"/>
+        </w:rPr>
+      </w:pPr>
     </w:p>
     <w:tbl>
       <w:tblPr>
@@ -1781,10 +2245,10 @@
         <w:tblLook w:val="04A0" w:firstRow="1" w:lastRow="0" w:firstColumn="1" w:lastColumn="0" w:noHBand="0" w:noVBand="1"/>
       </w:tblPr>
       <w:tblGrid>
-        <w:gridCol w:w="3074"/>
-        <w:gridCol w:w="1977"/>
-        <w:gridCol w:w="1850"/>
-        <w:gridCol w:w="3213"/>
+        <w:gridCol w:w="2874"/>
+        <w:gridCol w:w="1857"/>
+        <w:gridCol w:w="1790"/>
+        <w:gridCol w:w="3027"/>
       </w:tblGrid>
       <w:tr>
         <w:trPr>
@@ -2382,20 +2846,49 @@
     </w:p>
     <w:p>
       <w:pPr>
-        <w:spacing w:line="180" w:lineRule="auto"/>
-      </w:pPr>
-      <w:r>
-        <w:t>Constraints &amp; Assumptions:</w:t>
-      </w:r>
-    </w:p>
-    <w:p>
-      <w:pPr>
-        <w:spacing w:line="180" w:lineRule="auto"/>
+        <w:pBdr>
+          <w:bottom w:val="single" w:sz="12" w:space="1" w:color="auto"/>
+        </w:pBdr>
+        <w:spacing w:line="180" w:lineRule="auto"/>
+        <w:rPr>
+          <w:color w:val="2F5496" w:themeColor="accent1" w:themeShade="BF"/>
+          <w:sz w:val="36"/>
+          <w:szCs w:val="36"/>
+        </w:rPr>
+      </w:pPr>
+      <w:r>
+        <w:rPr>
+          <w:color w:val="2F5496" w:themeColor="accent1" w:themeShade="BF"/>
+          <w:sz w:val="36"/>
+          <w:szCs w:val="36"/>
+        </w:rPr>
+        <w:t>Constraints &amp; Assumptions</w:t>
+      </w:r>
+    </w:p>
+    <w:p>
+      <w:pPr>
+        <w:spacing w:line="180" w:lineRule="auto"/>
+        <w:rPr>
+          <w:color w:val="2F5496" w:themeColor="accent1" w:themeShade="BF"/>
+          <w:sz w:val="36"/>
+          <w:szCs w:val="36"/>
+        </w:rPr>
+      </w:pPr>
+    </w:p>
+    <w:p>
+      <w:pPr>
+        <w:spacing w:line="180" w:lineRule="auto"/>
+        <w:rPr>
+          <w:color w:val="2F5496" w:themeColor="accent1" w:themeShade="BF"/>
+          <w:u w:val="single"/>
+        </w:rPr>
       </w:pPr>
       <w:r>
         <w:rPr>
           <w:b/>
           <w:bCs/>
+          <w:color w:val="2F5496" w:themeColor="accent1" w:themeShade="BF"/>
+          <w:u w:val="single"/>
         </w:rPr>
         <w:t>Constraints</w:t>
       </w:r>
@@ -2480,11 +2973,27 @@
     <w:p>
       <w:pPr>
         <w:spacing w:line="180" w:lineRule="auto"/>
-      </w:pPr>
-      <w:r>
         <w:rPr>
           <w:b/>
           <w:bCs/>
+          <w:color w:val="2F5496" w:themeColor="accent1" w:themeShade="BF"/>
+        </w:rPr>
+      </w:pPr>
+    </w:p>
+    <w:p>
+      <w:pPr>
+        <w:spacing w:line="180" w:lineRule="auto"/>
+        <w:rPr>
+          <w:color w:val="2F5496" w:themeColor="accent1" w:themeShade="BF"/>
+          <w:u w:val="single"/>
+        </w:rPr>
+      </w:pPr>
+      <w:r>
+        <w:rPr>
+          <w:b/>
+          <w:bCs/>
+          <w:color w:val="2F5496" w:themeColor="accent1" w:themeShade="BF"/>
+          <w:u w:val="single"/>
         </w:rPr>
         <w:t>Assumptions</w:t>
       </w:r>
@@ -2545,9 +3054,16 @@
     <w:p>
       <w:pPr>
         <w:spacing w:line="180" w:lineRule="auto"/>
-      </w:pPr>
-      <w:r>
-        <w:t>Deliverables:</w:t>
+        <w:rPr>
+          <w:u w:val="single"/>
+        </w:rPr>
+      </w:pPr>
+      <w:r>
+        <w:rPr>
+          <w:color w:val="2F5496" w:themeColor="accent1" w:themeShade="BF"/>
+          <w:u w:val="single"/>
+        </w:rPr>
+        <w:t>Deliverables</w:t>
       </w:r>
     </w:p>
     <w:p>
@@ -2679,7 +3195,6 @@
         <w:spacing w:line="180" w:lineRule="auto"/>
       </w:pPr>
       <w:r>
-        <w:lastRenderedPageBreak/>
         <w:t xml:space="preserve">Increased operational efficiency and scalability for future order growth </w:t>
       </w:r>
     </w:p>
@@ -2743,7 +3258,13 @@
     </w:p>
     <w:sectPr>
       <w:pgSz w:w="11906" w:h="16838"/>
-      <w:pgMar w:top="851" w:right="851" w:bottom="851" w:left="851" w:header="708" w:footer="708" w:gutter="0"/>
+      <w:pgMar w:top="1134" w:right="1134" w:bottom="1134" w:left="1134" w:header="709" w:footer="709" w:gutter="0"/>
+      <w:pgBorders w:offsetFrom="page">
+        <w:top w:val="double" w:sz="4" w:space="24" w:color="auto"/>
+        <w:left w:val="double" w:sz="4" w:space="24" w:color="auto"/>
+        <w:bottom w:val="double" w:sz="4" w:space="24" w:color="auto"/>
+        <w:right w:val="double" w:sz="4" w:space="24" w:color="auto"/>
+      </w:pgBorders>
       <w:cols w:space="708"/>
       <w:docGrid w:linePitch="360"/>
     </w:sectPr>
@@ -2944,6 +3465,119 @@
     </w:lvl>
   </w:abstractNum>
   <w:abstractNum w:abstractNumId="2" w15:restartNumberingAfterBreak="0">
+    <w:nsid w:val="29334460"/>
+    <w:multiLevelType w:val="hybridMultilevel"/>
+    <w:tmpl w:val="C0F29384"/>
+    <w:lvl w:ilvl="0" w:tplc="40090001">
+      <w:start w:val="1"/>
+      <w:numFmt w:val="bullet"/>
+      <w:lvlText w:val=""/>
+      <w:lvlJc w:val="left"/>
+      <w:pPr>
+        <w:ind w:left="720" w:hanging="360"/>
+      </w:pPr>
+      <w:rPr>
+        <w:rFonts w:ascii="Symbol" w:hAnsi="Symbol" w:hint="default"/>
+      </w:rPr>
+    </w:lvl>
+    <w:lvl w:ilvl="1" w:tplc="40090003" w:tentative="1">
+      <w:start w:val="1"/>
+      <w:numFmt w:val="bullet"/>
+      <w:lvlText w:val="o"/>
+      <w:lvlJc w:val="left"/>
+      <w:pPr>
+        <w:ind w:left="1440" w:hanging="360"/>
+      </w:pPr>
+      <w:rPr>
+        <w:rFonts w:ascii="Courier New" w:hAnsi="Courier New" w:cs="Courier New" w:hint="default"/>
+      </w:rPr>
+    </w:lvl>
+    <w:lvl w:ilvl="2" w:tplc="40090005" w:tentative="1">
+      <w:start w:val="1"/>
+      <w:numFmt w:val="bullet"/>
+      <w:lvlText w:val=""/>
+      <w:lvlJc w:val="left"/>
+      <w:pPr>
+        <w:ind w:left="2160" w:hanging="360"/>
+      </w:pPr>
+      <w:rPr>
+        <w:rFonts w:ascii="Wingdings" w:hAnsi="Wingdings" w:hint="default"/>
+      </w:rPr>
+    </w:lvl>
+    <w:lvl w:ilvl="3" w:tplc="40090001" w:tentative="1">
+      <w:start w:val="1"/>
+      <w:numFmt w:val="bullet"/>
+      <w:lvlText w:val=""/>
+      <w:lvlJc w:val="left"/>
+      <w:pPr>
+        <w:ind w:left="2880" w:hanging="360"/>
+      </w:pPr>
+      <w:rPr>
+        <w:rFonts w:ascii="Symbol" w:hAnsi="Symbol" w:hint="default"/>
+      </w:rPr>
+    </w:lvl>
+    <w:lvl w:ilvl="4" w:tplc="40090003" w:tentative="1">
+      <w:start w:val="1"/>
+      <w:numFmt w:val="bullet"/>
+      <w:lvlText w:val="o"/>
+      <w:lvlJc w:val="left"/>
+      <w:pPr>
+        <w:ind w:left="3600" w:hanging="360"/>
+      </w:pPr>
+      <w:rPr>
+        <w:rFonts w:ascii="Courier New" w:hAnsi="Courier New" w:cs="Courier New" w:hint="default"/>
+      </w:rPr>
+    </w:lvl>
+    <w:lvl w:ilvl="5" w:tplc="40090005" w:tentative="1">
+      <w:start w:val="1"/>
+      <w:numFmt w:val="bullet"/>
+      <w:lvlText w:val=""/>
+      <w:lvlJc w:val="left"/>
+      <w:pPr>
+        <w:ind w:left="4320" w:hanging="360"/>
+      </w:pPr>
+      <w:rPr>
+        <w:rFonts w:ascii="Wingdings" w:hAnsi="Wingdings" w:hint="default"/>
+      </w:rPr>
+    </w:lvl>
+    <w:lvl w:ilvl="6" w:tplc="40090001" w:tentative="1">
+      <w:start w:val="1"/>
+      <w:numFmt w:val="bullet"/>
+      <w:lvlText w:val=""/>
+      <w:lvlJc w:val="left"/>
+      <w:pPr>
+        <w:ind w:left="5040" w:hanging="360"/>
+      </w:pPr>
+      <w:rPr>
+        <w:rFonts w:ascii="Symbol" w:hAnsi="Symbol" w:hint="default"/>
+      </w:rPr>
+    </w:lvl>
+    <w:lvl w:ilvl="7" w:tplc="40090003" w:tentative="1">
+      <w:start w:val="1"/>
+      <w:numFmt w:val="bullet"/>
+      <w:lvlText w:val="o"/>
+      <w:lvlJc w:val="left"/>
+      <w:pPr>
+        <w:ind w:left="5760" w:hanging="360"/>
+      </w:pPr>
+      <w:rPr>
+        <w:rFonts w:ascii="Courier New" w:hAnsi="Courier New" w:cs="Courier New" w:hint="default"/>
+      </w:rPr>
+    </w:lvl>
+    <w:lvl w:ilvl="8" w:tplc="40090005" w:tentative="1">
+      <w:start w:val="1"/>
+      <w:numFmt w:val="bullet"/>
+      <w:lvlText w:val=""/>
+      <w:lvlJc w:val="left"/>
+      <w:pPr>
+        <w:ind w:left="6480" w:hanging="360"/>
+      </w:pPr>
+      <w:rPr>
+        <w:rFonts w:ascii="Wingdings" w:hAnsi="Wingdings" w:hint="default"/>
+      </w:rPr>
+    </w:lvl>
+  </w:abstractNum>
+  <w:abstractNum w:abstractNumId="3" w15:restartNumberingAfterBreak="0">
     <w:nsid w:val="65D84ECC"/>
     <w:multiLevelType w:val="multilevel"/>
     <w:tmpl w:val="3D8A5DF2"/>
@@ -3092,7 +3726,7 @@
       </w:rPr>
     </w:lvl>
   </w:abstractNum>
-  <w:abstractNum w:abstractNumId="3" w15:restartNumberingAfterBreak="0">
+  <w:abstractNum w:abstractNumId="4" w15:restartNumberingAfterBreak="0">
     <w:nsid w:val="681E0F19"/>
     <w:multiLevelType w:val="multilevel"/>
     <w:tmpl w:val="E250D842"/>
@@ -3241,7 +3875,120 @@
       </w:rPr>
     </w:lvl>
   </w:abstractNum>
-  <w:abstractNum w:abstractNumId="4" w15:restartNumberingAfterBreak="0">
+  <w:abstractNum w:abstractNumId="5" w15:restartNumberingAfterBreak="0">
+    <w:nsid w:val="6A5A4390"/>
+    <w:multiLevelType w:val="hybridMultilevel"/>
+    <w:tmpl w:val="47FCF496"/>
+    <w:lvl w:ilvl="0" w:tplc="40090001">
+      <w:start w:val="1"/>
+      <w:numFmt w:val="bullet"/>
+      <w:lvlText w:val=""/>
+      <w:lvlJc w:val="left"/>
+      <w:pPr>
+        <w:ind w:left="1440" w:hanging="360"/>
+      </w:pPr>
+      <w:rPr>
+        <w:rFonts w:ascii="Symbol" w:hAnsi="Symbol" w:hint="default"/>
+      </w:rPr>
+    </w:lvl>
+    <w:lvl w:ilvl="1" w:tplc="40090003" w:tentative="1">
+      <w:start w:val="1"/>
+      <w:numFmt w:val="bullet"/>
+      <w:lvlText w:val="o"/>
+      <w:lvlJc w:val="left"/>
+      <w:pPr>
+        <w:ind w:left="2160" w:hanging="360"/>
+      </w:pPr>
+      <w:rPr>
+        <w:rFonts w:ascii="Courier New" w:hAnsi="Courier New" w:cs="Courier New" w:hint="default"/>
+      </w:rPr>
+    </w:lvl>
+    <w:lvl w:ilvl="2" w:tplc="40090005" w:tentative="1">
+      <w:start w:val="1"/>
+      <w:numFmt w:val="bullet"/>
+      <w:lvlText w:val=""/>
+      <w:lvlJc w:val="left"/>
+      <w:pPr>
+        <w:ind w:left="2880" w:hanging="360"/>
+      </w:pPr>
+      <w:rPr>
+        <w:rFonts w:ascii="Wingdings" w:hAnsi="Wingdings" w:hint="default"/>
+      </w:rPr>
+    </w:lvl>
+    <w:lvl w:ilvl="3" w:tplc="40090001" w:tentative="1">
+      <w:start w:val="1"/>
+      <w:numFmt w:val="bullet"/>
+      <w:lvlText w:val=""/>
+      <w:lvlJc w:val="left"/>
+      <w:pPr>
+        <w:ind w:left="3600" w:hanging="360"/>
+      </w:pPr>
+      <w:rPr>
+        <w:rFonts w:ascii="Symbol" w:hAnsi="Symbol" w:hint="default"/>
+      </w:rPr>
+    </w:lvl>
+    <w:lvl w:ilvl="4" w:tplc="40090003" w:tentative="1">
+      <w:start w:val="1"/>
+      <w:numFmt w:val="bullet"/>
+      <w:lvlText w:val="o"/>
+      <w:lvlJc w:val="left"/>
+      <w:pPr>
+        <w:ind w:left="4320" w:hanging="360"/>
+      </w:pPr>
+      <w:rPr>
+        <w:rFonts w:ascii="Courier New" w:hAnsi="Courier New" w:cs="Courier New" w:hint="default"/>
+      </w:rPr>
+    </w:lvl>
+    <w:lvl w:ilvl="5" w:tplc="40090005" w:tentative="1">
+      <w:start w:val="1"/>
+      <w:numFmt w:val="bullet"/>
+      <w:lvlText w:val=""/>
+      <w:lvlJc w:val="left"/>
+      <w:pPr>
+        <w:ind w:left="5040" w:hanging="360"/>
+      </w:pPr>
+      <w:rPr>
+        <w:rFonts w:ascii="Wingdings" w:hAnsi="Wingdings" w:hint="default"/>
+      </w:rPr>
+    </w:lvl>
+    <w:lvl w:ilvl="6" w:tplc="40090001" w:tentative="1">
+      <w:start w:val="1"/>
+      <w:numFmt w:val="bullet"/>
+      <w:lvlText w:val=""/>
+      <w:lvlJc w:val="left"/>
+      <w:pPr>
+        <w:ind w:left="5760" w:hanging="360"/>
+      </w:pPr>
+      <w:rPr>
+        <w:rFonts w:ascii="Symbol" w:hAnsi="Symbol" w:hint="default"/>
+      </w:rPr>
+    </w:lvl>
+    <w:lvl w:ilvl="7" w:tplc="40090003" w:tentative="1">
+      <w:start w:val="1"/>
+      <w:numFmt w:val="bullet"/>
+      <w:lvlText w:val="o"/>
+      <w:lvlJc w:val="left"/>
+      <w:pPr>
+        <w:ind w:left="6480" w:hanging="360"/>
+      </w:pPr>
+      <w:rPr>
+        <w:rFonts w:ascii="Courier New" w:hAnsi="Courier New" w:cs="Courier New" w:hint="default"/>
+      </w:rPr>
+    </w:lvl>
+    <w:lvl w:ilvl="8" w:tplc="40090005" w:tentative="1">
+      <w:start w:val="1"/>
+      <w:numFmt w:val="bullet"/>
+      <w:lvlText w:val=""/>
+      <w:lvlJc w:val="left"/>
+      <w:pPr>
+        <w:ind w:left="7200" w:hanging="360"/>
+      </w:pPr>
+      <w:rPr>
+        <w:rFonts w:ascii="Wingdings" w:hAnsi="Wingdings" w:hint="default"/>
+      </w:rPr>
+    </w:lvl>
+  </w:abstractNum>
+  <w:abstractNum w:abstractNumId="6" w15:restartNumberingAfterBreak="0">
     <w:nsid w:val="73597D6E"/>
     <w:multiLevelType w:val="multilevel"/>
     <w:tmpl w:val="04E8A9CC"/>
@@ -3390,7 +4137,7 @@
       </w:rPr>
     </w:lvl>
   </w:abstractNum>
-  <w:abstractNum w:abstractNumId="5" w15:restartNumberingAfterBreak="0">
+  <w:abstractNum w:abstractNumId="7" w15:restartNumberingAfterBreak="0">
     <w:nsid w:val="7E8631AD"/>
     <w:multiLevelType w:val="multilevel"/>
     <w:tmpl w:val="E5F2F88A"/>
@@ -3540,30 +4287,27 @@
     </w:lvl>
   </w:abstractNum>
   <w:num w:numId="1" w16cid:durableId="1416244530">
-    <w:abstractNumId w:val="4"/>
+    <w:abstractNumId w:val="6"/>
   </w:num>
   <w:num w:numId="2" w16cid:durableId="2097358904">
-    <w:abstractNumId w:val="3"/>
+    <w:abstractNumId w:val="4"/>
   </w:num>
   <w:num w:numId="3" w16cid:durableId="382294235">
     <w:abstractNumId w:val="0"/>
   </w:num>
   <w:num w:numId="4" w16cid:durableId="889265647">
-    <w:abstractNumId w:val="5"/>
+    <w:abstractNumId w:val="7"/>
   </w:num>
   <w:num w:numId="5" w16cid:durableId="1853572642">
     <w:abstractNumId w:val="1"/>
-    <w:lvlOverride w:ilvl="0"/>
-    <w:lvlOverride w:ilvl="1"/>
-    <w:lvlOverride w:ilvl="2"/>
-    <w:lvlOverride w:ilvl="3"/>
-    <w:lvlOverride w:ilvl="4"/>
-    <w:lvlOverride w:ilvl="5"/>
-    <w:lvlOverride w:ilvl="6"/>
-    <w:lvlOverride w:ilvl="7"/>
-    <w:lvlOverride w:ilvl="8"/>
   </w:num>
   <w:num w:numId="6" w16cid:durableId="1261838542">
+    <w:abstractNumId w:val="3"/>
+  </w:num>
+  <w:num w:numId="7" w16cid:durableId="2089955043">
+    <w:abstractNumId w:val="5"/>
+  </w:num>
+  <w:num w:numId="8" w16cid:durableId="497812820">
     <w:abstractNumId w:val="2"/>
   </w:num>
 </w:numbering>
@@ -4171,6 +4915,7 @@
   <w:style w:type="character" w:default="1" w:styleId="DefaultParagraphFont">
     <w:name w:val="Default Paragraph Font"/>
     <w:uiPriority w:val="1"/>
+    <w:semiHidden/>
     <w:unhideWhenUsed/>
   </w:style>
   <w:style w:type="table" w:default="1" w:styleId="TableNormal">
@@ -4695,6 +5440,82 @@
       </w:tcPr>
     </w:tblStylePr>
   </w:style>
+  <w:style w:type="table" w:styleId="GridTable4-Accent2">
+    <w:name w:val="Grid Table 4 Accent 2"/>
+    <w:basedOn w:val="TableNormal"/>
+    <w:uiPriority w:val="49"/>
+    <w:rsid w:val="009A6A94"/>
+    <w:pPr>
+      <w:spacing w:after="0" w:line="240" w:lineRule="auto"/>
+    </w:pPr>
+    <w:tblPr>
+      <w:tblStyleRowBandSize w:val="1"/>
+      <w:tblStyleColBandSize w:val="1"/>
+      <w:tblBorders>
+        <w:top w:val="single" w:sz="4" w:space="0" w:color="F4B083" w:themeColor="accent2" w:themeTint="99"/>
+        <w:left w:val="single" w:sz="4" w:space="0" w:color="F4B083" w:themeColor="accent2" w:themeTint="99"/>
+        <w:bottom w:val="single" w:sz="4" w:space="0" w:color="F4B083" w:themeColor="accent2" w:themeTint="99"/>
+        <w:right w:val="single" w:sz="4" w:space="0" w:color="F4B083" w:themeColor="accent2" w:themeTint="99"/>
+        <w:insideH w:val="single" w:sz="4" w:space="0" w:color="F4B083" w:themeColor="accent2" w:themeTint="99"/>
+        <w:insideV w:val="single" w:sz="4" w:space="0" w:color="F4B083" w:themeColor="accent2" w:themeTint="99"/>
+      </w:tblBorders>
+    </w:tblPr>
+    <w:tblStylePr w:type="firstRow">
+      <w:rPr>
+        <w:b/>
+        <w:bCs/>
+        <w:color w:val="FFFFFF" w:themeColor="background1"/>
+      </w:rPr>
+      <w:tblPr/>
+      <w:tcPr>
+        <w:tcBorders>
+          <w:top w:val="single" w:sz="4" w:space="0" w:color="ED7D31" w:themeColor="accent2"/>
+          <w:left w:val="single" w:sz="4" w:space="0" w:color="ED7D31" w:themeColor="accent2"/>
+          <w:bottom w:val="single" w:sz="4" w:space="0" w:color="ED7D31" w:themeColor="accent2"/>
+          <w:right w:val="single" w:sz="4" w:space="0" w:color="ED7D31" w:themeColor="accent2"/>
+          <w:insideH w:val="nil"/>
+          <w:insideV w:val="nil"/>
+        </w:tcBorders>
+        <w:shd w:val="clear" w:color="auto" w:fill="ED7D31" w:themeFill="accent2"/>
+      </w:tcPr>
+    </w:tblStylePr>
+    <w:tblStylePr w:type="lastRow">
+      <w:rPr>
+        <w:b/>
+        <w:bCs/>
+      </w:rPr>
+      <w:tblPr/>
+      <w:tcPr>
+        <w:tcBorders>
+          <w:top w:val="double" w:sz="4" w:space="0" w:color="ED7D31" w:themeColor="accent2"/>
+        </w:tcBorders>
+      </w:tcPr>
+    </w:tblStylePr>
+    <w:tblStylePr w:type="firstCol">
+      <w:rPr>
+        <w:b/>
+        <w:bCs/>
+      </w:rPr>
+    </w:tblStylePr>
+    <w:tblStylePr w:type="lastCol">
+      <w:rPr>
+        <w:b/>
+        <w:bCs/>
+      </w:rPr>
+    </w:tblStylePr>
+    <w:tblStylePr w:type="band1Vert">
+      <w:tblPr/>
+      <w:tcPr>
+        <w:shd w:val="clear" w:color="auto" w:fill="FBE4D5" w:themeFill="accent2" w:themeFillTint="33"/>
+      </w:tcPr>
+    </w:tblStylePr>
+    <w:tblStylePr w:type="band1Horz">
+      <w:tblPr/>
+      <w:tcPr>
+        <w:shd w:val="clear" w:color="auto" w:fill="FBE4D5" w:themeFill="accent2" w:themeFillTint="33"/>
+      </w:tcPr>
+    </w:tblStylePr>
+  </w:style>
 </w:styles>
 </file>
 

</xml_diff>

<commit_message>
Added project timeline(sprint plan ) in Project documentation
</commit_message>
<xml_diff>
--- a/01RetailEasy Documentation.docx
+++ b/01RetailEasy Documentation.docx
@@ -123,7 +123,6 @@
           <w:szCs w:val="96"/>
         </w:rPr>
       </w:pPr>
-      <w:proofErr w:type="spellStart"/>
       <w:r>
         <w:rPr>
           <w:rFonts w:ascii="Algerian" w:hAnsi="Algerian" w:cs="Times New Roman"/>
@@ -133,43 +132,7 @@
           <w:sz w:val="96"/>
           <w:szCs w:val="96"/>
         </w:rPr>
-        <w:t>RetailEasy</w:t>
-      </w:r>
-      <w:proofErr w:type="spellEnd"/>
-      <w:r>
-        <w:rPr>
-          <w:rFonts w:ascii="Algerian" w:hAnsi="Algerian" w:cs="Times New Roman"/>
-          <w:b/>
-          <w:bCs/>
-          <w:color w:val="2F5496" w:themeColor="accent1" w:themeShade="BF"/>
-          <w:sz w:val="96"/>
-          <w:szCs w:val="96"/>
-        </w:rPr>
-        <w:t xml:space="preserve"> </w:t>
-      </w:r>
-      <w:proofErr w:type="spellStart"/>
-      <w:r>
-        <w:rPr>
-          <w:rFonts w:ascii="Algerian" w:hAnsi="Algerian" w:cs="Times New Roman"/>
-          <w:b/>
-          <w:bCs/>
-          <w:color w:val="2F5496" w:themeColor="accent1" w:themeShade="BF"/>
-          <w:sz w:val="96"/>
-          <w:szCs w:val="96"/>
-        </w:rPr>
-        <w:t>Pvt.</w:t>
-      </w:r>
-      <w:proofErr w:type="spellEnd"/>
-      <w:r>
-        <w:rPr>
-          <w:rFonts w:ascii="Algerian" w:hAnsi="Algerian" w:cs="Times New Roman"/>
-          <w:b/>
-          <w:bCs/>
-          <w:color w:val="2F5496" w:themeColor="accent1" w:themeShade="BF"/>
-          <w:sz w:val="96"/>
-          <w:szCs w:val="96"/>
-        </w:rPr>
-        <w:t xml:space="preserve"> Ltd.</w:t>
+        <w:t>RetailEasy Pvt. Ltd.</w:t>
       </w:r>
     </w:p>
     <w:p>
@@ -397,7 +360,7 @@
         <w:tc>
           <w:tcPr>
             <w:cnfStyle w:val="001000000000" w:firstRow="0" w:lastRow="0" w:firstColumn="1" w:lastColumn="0" w:oddVBand="0" w:evenVBand="0" w:oddHBand="0" w:evenHBand="0" w:firstRowFirstColumn="0" w:firstRowLastColumn="0" w:lastRowFirstColumn="0" w:lastRowLastColumn="0"/>
-            <w:tcW w:w="1129" w:type="dxa"/>
+            <w:tcW w:w="1120" w:type="dxa"/>
           </w:tcPr>
           <w:p>
             <w:pPr>
@@ -421,7 +384,7 @@
         </w:tc>
         <w:tc>
           <w:tcPr>
-            <w:tcW w:w="9065" w:type="dxa"/>
+            <w:tcW w:w="8508" w:type="dxa"/>
           </w:tcPr>
           <w:p>
             <w:pPr>
@@ -452,7 +415,7 @@
         <w:tc>
           <w:tcPr>
             <w:cnfStyle w:val="001000000000" w:firstRow="0" w:lastRow="0" w:firstColumn="1" w:lastColumn="0" w:oddVBand="0" w:evenVBand="0" w:oddHBand="0" w:evenHBand="0" w:firstRowFirstColumn="0" w:firstRowLastColumn="0" w:lastRowFirstColumn="0" w:lastRowLastColumn="0"/>
-            <w:tcW w:w="1129" w:type="dxa"/>
+            <w:tcW w:w="1120" w:type="dxa"/>
           </w:tcPr>
           <w:p>
             <w:pPr>
@@ -476,7 +439,7 @@
         </w:tc>
         <w:tc>
           <w:tcPr>
-            <w:tcW w:w="9065" w:type="dxa"/>
+            <w:tcW w:w="8508" w:type="dxa"/>
           </w:tcPr>
           <w:p>
             <w:pPr>
@@ -506,7 +469,7 @@
         <w:tc>
           <w:tcPr>
             <w:cnfStyle w:val="001000000000" w:firstRow="0" w:lastRow="0" w:firstColumn="1" w:lastColumn="0" w:oddVBand="0" w:evenVBand="0" w:oddHBand="0" w:evenHBand="0" w:firstRowFirstColumn="0" w:firstRowLastColumn="0" w:lastRowFirstColumn="0" w:lastRowLastColumn="0"/>
-            <w:tcW w:w="1129" w:type="dxa"/>
+            <w:tcW w:w="1120" w:type="dxa"/>
           </w:tcPr>
           <w:p>
             <w:pPr>
@@ -530,7 +493,7 @@
         </w:tc>
         <w:tc>
           <w:tcPr>
-            <w:tcW w:w="9065" w:type="dxa"/>
+            <w:tcW w:w="8508" w:type="dxa"/>
           </w:tcPr>
           <w:p>
             <w:pPr>
@@ -563,7 +526,7 @@
         <w:tc>
           <w:tcPr>
             <w:cnfStyle w:val="001000000000" w:firstRow="0" w:lastRow="0" w:firstColumn="1" w:lastColumn="0" w:oddVBand="0" w:evenVBand="0" w:oddHBand="0" w:evenHBand="0" w:firstRowFirstColumn="0" w:firstRowLastColumn="0" w:lastRowFirstColumn="0" w:lastRowLastColumn="0"/>
-            <w:tcW w:w="1129" w:type="dxa"/>
+            <w:tcW w:w="1120" w:type="dxa"/>
           </w:tcPr>
           <w:p>
             <w:pPr>
@@ -587,7 +550,7 @@
         </w:tc>
         <w:tc>
           <w:tcPr>
-            <w:tcW w:w="9065" w:type="dxa"/>
+            <w:tcW w:w="8508" w:type="dxa"/>
           </w:tcPr>
           <w:p>
             <w:pPr>
@@ -617,7 +580,7 @@
         <w:tc>
           <w:tcPr>
             <w:cnfStyle w:val="001000000000" w:firstRow="0" w:lastRow="0" w:firstColumn="1" w:lastColumn="0" w:oddVBand="0" w:evenVBand="0" w:oddHBand="0" w:evenHBand="0" w:firstRowFirstColumn="0" w:firstRowLastColumn="0" w:lastRowFirstColumn="0" w:lastRowLastColumn="0"/>
-            <w:tcW w:w="1129" w:type="dxa"/>
+            <w:tcW w:w="1120" w:type="dxa"/>
           </w:tcPr>
           <w:p>
             <w:pPr>
@@ -641,7 +604,7 @@
         </w:tc>
         <w:tc>
           <w:tcPr>
-            <w:tcW w:w="9065" w:type="dxa"/>
+            <w:tcW w:w="8508" w:type="dxa"/>
           </w:tcPr>
           <w:p>
             <w:pPr>
@@ -674,7 +637,7 @@
         <w:tc>
           <w:tcPr>
             <w:cnfStyle w:val="001000000000" w:firstRow="0" w:lastRow="0" w:firstColumn="1" w:lastColumn="0" w:oddVBand="0" w:evenVBand="0" w:oddHBand="0" w:evenHBand="0" w:firstRowFirstColumn="0" w:firstRowLastColumn="0" w:lastRowFirstColumn="0" w:lastRowLastColumn="0"/>
-            <w:tcW w:w="1129" w:type="dxa"/>
+            <w:tcW w:w="1120" w:type="dxa"/>
           </w:tcPr>
           <w:p>
             <w:pPr>
@@ -698,7 +661,7 @@
         </w:tc>
         <w:tc>
           <w:tcPr>
-            <w:tcW w:w="9065" w:type="dxa"/>
+            <w:tcW w:w="8508" w:type="dxa"/>
           </w:tcPr>
           <w:p>
             <w:pPr>
@@ -728,7 +691,7 @@
         <w:tc>
           <w:tcPr>
             <w:cnfStyle w:val="001000000000" w:firstRow="0" w:lastRow="0" w:firstColumn="1" w:lastColumn="0" w:oddVBand="0" w:evenVBand="0" w:oddHBand="0" w:evenHBand="0" w:firstRowFirstColumn="0" w:firstRowLastColumn="0" w:lastRowFirstColumn="0" w:lastRowLastColumn="0"/>
-            <w:tcW w:w="1129" w:type="dxa"/>
+            <w:tcW w:w="1120" w:type="dxa"/>
           </w:tcPr>
           <w:p>
             <w:pPr>
@@ -752,7 +715,7 @@
         </w:tc>
         <w:tc>
           <w:tcPr>
-            <w:tcW w:w="9065" w:type="dxa"/>
+            <w:tcW w:w="8508" w:type="dxa"/>
           </w:tcPr>
           <w:p>
             <w:pPr>
@@ -785,7 +748,7 @@
         <w:tc>
           <w:tcPr>
             <w:cnfStyle w:val="001000000000" w:firstRow="0" w:lastRow="0" w:firstColumn="1" w:lastColumn="0" w:oddVBand="0" w:evenVBand="0" w:oddHBand="0" w:evenHBand="0" w:firstRowFirstColumn="0" w:firstRowLastColumn="0" w:lastRowFirstColumn="0" w:lastRowLastColumn="0"/>
-            <w:tcW w:w="1129" w:type="dxa"/>
+            <w:tcW w:w="1120" w:type="dxa"/>
           </w:tcPr>
           <w:p>
             <w:pPr>
@@ -809,7 +772,7 @@
         </w:tc>
         <w:tc>
           <w:tcPr>
-            <w:tcW w:w="9065" w:type="dxa"/>
+            <w:tcW w:w="8508" w:type="dxa"/>
           </w:tcPr>
           <w:p>
             <w:pPr>
@@ -839,7 +802,7 @@
         <w:tc>
           <w:tcPr>
             <w:cnfStyle w:val="001000000000" w:firstRow="0" w:lastRow="0" w:firstColumn="1" w:lastColumn="0" w:oddVBand="0" w:evenVBand="0" w:oddHBand="0" w:evenHBand="0" w:firstRowFirstColumn="0" w:firstRowLastColumn="0" w:lastRowFirstColumn="0" w:lastRowLastColumn="0"/>
-            <w:tcW w:w="1129" w:type="dxa"/>
+            <w:tcW w:w="1120" w:type="dxa"/>
           </w:tcPr>
           <w:p>
             <w:pPr>
@@ -863,7 +826,7 @@
         </w:tc>
         <w:tc>
           <w:tcPr>
-            <w:tcW w:w="9065" w:type="dxa"/>
+            <w:tcW w:w="8508" w:type="dxa"/>
           </w:tcPr>
           <w:p>
             <w:pPr>
@@ -889,6 +852,61 @@
           </w:p>
         </w:tc>
       </w:tr>
+      <w:tr>
+        <w:trPr>
+          <w:cnfStyle w:val="000000100000" w:firstRow="0" w:lastRow="0" w:firstColumn="0" w:lastColumn="0" w:oddVBand="0" w:evenVBand="0" w:oddHBand="1" w:evenHBand="0" w:firstRowFirstColumn="0" w:firstRowLastColumn="0" w:lastRowFirstColumn="0" w:lastRowLastColumn="0"/>
+        </w:trPr>
+        <w:tc>
+          <w:tcPr>
+            <w:cnfStyle w:val="001000000000" w:firstRow="0" w:lastRow="0" w:firstColumn="1" w:lastColumn="0" w:oddVBand="0" w:evenVBand="0" w:oddHBand="0" w:evenHBand="0" w:firstRowFirstColumn="0" w:firstRowLastColumn="0" w:lastRowFirstColumn="0" w:lastRowLastColumn="0"/>
+            <w:tcW w:w="1120" w:type="dxa"/>
+          </w:tcPr>
+          <w:p>
+            <w:pPr>
+              <w:rPr>
+                <w:rFonts w:ascii="Times New Roman" w:hAnsi="Times New Roman" w:cs="Times New Roman"/>
+                <w:sz w:val="36"/>
+                <w:szCs w:val="36"/>
+              </w:rPr>
+            </w:pPr>
+            <w:r>
+              <w:rPr>
+                <w:rFonts w:ascii="Times New Roman" w:hAnsi="Times New Roman" w:cs="Times New Roman"/>
+                <w:sz w:val="36"/>
+                <w:szCs w:val="36"/>
+              </w:rPr>
+              <w:t>9.</w:t>
+            </w:r>
+          </w:p>
+        </w:tc>
+        <w:tc>
+          <w:tcPr>
+            <w:tcW w:w="8508" w:type="dxa"/>
+          </w:tcPr>
+          <w:p>
+            <w:pPr>
+              <w:cnfStyle w:val="000000100000" w:firstRow="0" w:lastRow="0" w:firstColumn="0" w:lastColumn="0" w:oddVBand="0" w:evenVBand="0" w:oddHBand="1" w:evenHBand="0" w:firstRowFirstColumn="0" w:firstRowLastColumn="0" w:lastRowFirstColumn="0" w:lastRowLastColumn="0"/>
+              <w:rPr>
+                <w:rFonts w:ascii="Times New Roman" w:hAnsi="Times New Roman" w:cs="Times New Roman"/>
+                <w:b/>
+                <w:bCs/>
+                <w:sz w:val="36"/>
+                <w:szCs w:val="36"/>
+              </w:rPr>
+            </w:pPr>
+            <w:r>
+              <w:rPr>
+                <w:rFonts w:ascii="Times New Roman" w:hAnsi="Times New Roman" w:cs="Times New Roman"/>
+                <w:b/>
+                <w:bCs/>
+                <w:sz w:val="36"/>
+                <w:szCs w:val="36"/>
+              </w:rPr>
+              <w:t>Project Timeline(High Level Sprint Plan)</w:t>
+            </w:r>
+          </w:p>
+        </w:tc>
+      </w:tr>
     </w:tbl>
     <w:p>
       <w:pPr>
@@ -952,29 +970,8 @@
       <w:r>
         <w:br/>
       </w:r>
-      <w:proofErr w:type="spellStart"/>
-      <w:r>
-        <w:t>RetailEasy</w:t>
-      </w:r>
-      <w:proofErr w:type="spellEnd"/>
-      <w:r>
-        <w:t xml:space="preserve"> </w:t>
-      </w:r>
-      <w:proofErr w:type="spellStart"/>
-      <w:r>
-        <w:t>Pvt.</w:t>
-      </w:r>
-      <w:proofErr w:type="spellEnd"/>
-      <w:r>
-        <w:t xml:space="preserve"> Ltd. is a fast-growing Indian e-commerce company founded in Pune, Maharashtra. Initially established as a small fashion reseller, the company has expanded its operations across Maharashtra and Karnataka through its website and mobile application. </w:t>
-      </w:r>
-      <w:proofErr w:type="spellStart"/>
-      <w:r>
-        <w:t>RetailEasy</w:t>
-      </w:r>
-      <w:proofErr w:type="spellEnd"/>
-      <w:r>
-        <w:t xml:space="preserve"> currently sells clothing, footwear, and consumer electronics to a rapidly growing customer base.</w:t>
+      <w:r>
+        <w:t>RetailEasy Pvt. Ltd. is a fast-growing Indian e-commerce company founded in Pune, Maharashtra. Initially established as a small fashion reseller, the company has expanded its operations across Maharashtra and Karnataka through its website and mobile application. RetailEasy currently sells clothing, footwear, and consumer electronics to a rapidly growing customer base.</w:t>
       </w:r>
     </w:p>
     <w:p>
@@ -1035,15 +1032,7 @@
         <w:spacing w:line="180" w:lineRule="auto"/>
       </w:pPr>
       <w:r>
-        <w:t xml:space="preserve">Currently, </w:t>
-      </w:r>
-      <w:proofErr w:type="spellStart"/>
-      <w:r>
-        <w:t>RetailEasy</w:t>
-      </w:r>
-      <w:proofErr w:type="spellEnd"/>
-      <w:r>
-        <w:t xml:space="preserve"> manages product return requests manually through email communication. Customers initiate return requests by sending emails to the support team. These emails are reviewed by customer service agents either on the same day or the following day. In many cases, agents must request additional information such as the order ID, product images, and reason for return, which further delays the process as customers often respond a day later.</w:t>
+        <w:t>Currently, RetailEasy manages product return requests manually through email communication. Customers initiate return requests by sending emails to the support team. These emails are reviewed by customer service agents either on the same day or the following day. In many cases, agents must request additional information such as the order ID, product images, and reason for return, which further delays the process as customers often respond a day later.</w:t>
       </w:r>
     </w:p>
     <w:p>
@@ -1241,47 +1230,7 @@
           <w:lang w:eastAsia="ja-JP" w:bidi="mr-IN"/>
           <w14:ligatures w14:val="none"/>
         </w:rPr>
-        <w:t xml:space="preserve">The primary objective of this project is to design and implement an automated returns and refund management system for </w:t>
-      </w:r>
-      <w:proofErr w:type="spellStart"/>
-      <w:r>
-        <w:rPr>
-          <w:rFonts w:ascii="Times New Roman" w:eastAsia="Times New Roman" w:hAnsi="Times New Roman" w:cs="Times New Roman"/>
-          <w:kern w:val="0"/>
-          <w:lang w:eastAsia="ja-JP" w:bidi="mr-IN"/>
-          <w14:ligatures w14:val="none"/>
-        </w:rPr>
-        <w:t>RetailEasy</w:t>
-      </w:r>
-      <w:proofErr w:type="spellEnd"/>
-      <w:r>
-        <w:rPr>
-          <w:rFonts w:ascii="Times New Roman" w:eastAsia="Times New Roman" w:hAnsi="Times New Roman" w:cs="Times New Roman"/>
-          <w:kern w:val="0"/>
-          <w:lang w:eastAsia="ja-JP" w:bidi="mr-IN"/>
-          <w14:ligatures w14:val="none"/>
-        </w:rPr>
-        <w:t xml:space="preserve"> </w:t>
-      </w:r>
-      <w:proofErr w:type="spellStart"/>
-      <w:r>
-        <w:rPr>
-          <w:rFonts w:ascii="Times New Roman" w:eastAsia="Times New Roman" w:hAnsi="Times New Roman" w:cs="Times New Roman"/>
-          <w:kern w:val="0"/>
-          <w:lang w:eastAsia="ja-JP" w:bidi="mr-IN"/>
-          <w14:ligatures w14:val="none"/>
-        </w:rPr>
-        <w:t>Pvt.</w:t>
-      </w:r>
-      <w:proofErr w:type="spellEnd"/>
-      <w:r>
-        <w:rPr>
-          <w:rFonts w:ascii="Times New Roman" w:eastAsia="Times New Roman" w:hAnsi="Times New Roman" w:cs="Times New Roman"/>
-          <w:kern w:val="0"/>
-          <w:lang w:eastAsia="ja-JP" w:bidi="mr-IN"/>
-          <w14:ligatures w14:val="none"/>
-        </w:rPr>
-        <w:t xml:space="preserve"> Ltd. The proposed solution aims to streamline the complete return lifecycle, from return request initiation to refund processing and status updates.</w:t>
+        <w:t>The primary objective of this project is to design and implement an automated returns and refund management system for RetailEasy Pvt. Ltd. The proposed solution aims to streamline the complete return lifecycle, from return request initiation to refund processing and status updates.</w:t>
       </w:r>
     </w:p>
     <w:p>
@@ -2149,13 +2098,8 @@
               <w:spacing w:line="180" w:lineRule="auto"/>
               <w:jc w:val="center"/>
             </w:pPr>
-            <w:proofErr w:type="spellStart"/>
-            <w:r>
-              <w:t>RetailEasy</w:t>
-            </w:r>
-            <w:proofErr w:type="spellEnd"/>
-            <w:r>
-              <w:t xml:space="preserve"> | Customers</w:t>
+            <w:r>
+              <w:t>RetailEasy | Customers</w:t>
             </w:r>
           </w:p>
         </w:tc>
@@ -3053,18 +2997,36 @@
     </w:p>
     <w:p>
       <w:pPr>
-        <w:spacing w:line="180" w:lineRule="auto"/>
-        <w:rPr>
+        <w:pBdr>
+          <w:bottom w:val="single" w:sz="12" w:space="1" w:color="auto"/>
+        </w:pBdr>
+        <w:spacing w:line="180" w:lineRule="auto"/>
+        <w:rPr>
+          <w:color w:val="2F5496" w:themeColor="accent1" w:themeShade="BF"/>
+          <w:sz w:val="32"/>
+          <w:szCs w:val="32"/>
           <w:u w:val="single"/>
         </w:rPr>
       </w:pPr>
       <w:r>
         <w:rPr>
           <w:color w:val="2F5496" w:themeColor="accent1" w:themeShade="BF"/>
+          <w:sz w:val="32"/>
+          <w:szCs w:val="32"/>
           <w:u w:val="single"/>
         </w:rPr>
         <w:t>Deliverables</w:t>
       </w:r>
+    </w:p>
+    <w:p>
+      <w:pPr>
+        <w:spacing w:line="180" w:lineRule="auto"/>
+        <w:rPr>
+          <w:sz w:val="32"/>
+          <w:szCs w:val="32"/>
+          <w:u w:val="single"/>
+        </w:rPr>
+      </w:pPr>
     </w:p>
     <w:p>
       <w:pPr>
@@ -3253,7 +3215,884 @@
     </w:p>
     <w:p>
       <w:pPr>
-        <w:spacing w:line="180" w:lineRule="auto"/>
+        <w:pBdr>
+          <w:bottom w:val="single" w:sz="12" w:space="1" w:color="auto"/>
+        </w:pBdr>
+        <w:spacing w:line="180" w:lineRule="auto"/>
+        <w:rPr>
+          <w:b/>
+          <w:bCs/>
+          <w:color w:val="4472C4" w:themeColor="accent1"/>
+          <w:sz w:val="32"/>
+          <w:szCs w:val="32"/>
+        </w:rPr>
+      </w:pPr>
+      <w:r>
+        <w:rPr>
+          <w:b/>
+          <w:bCs/>
+          <w:color w:val="4472C4" w:themeColor="accent1"/>
+          <w:sz w:val="32"/>
+          <w:szCs w:val="32"/>
+        </w:rPr>
+        <w:t>PROJECT TIMELINE (SPRINT LINE)</w:t>
+      </w:r>
+    </w:p>
+    <w:tbl>
+      <w:tblPr>
+        <w:tblStyle w:val="GridTable4-Accent2"/>
+        <w:tblW w:w="9924" w:type="dxa"/>
+        <w:tblLook w:val="04A0" w:firstRow="1" w:lastRow="0" w:firstColumn="1" w:lastColumn="0" w:noHBand="0" w:noVBand="1"/>
+      </w:tblPr>
+      <w:tblGrid>
+        <w:gridCol w:w="835"/>
+        <w:gridCol w:w="1101"/>
+        <w:gridCol w:w="1636"/>
+        <w:gridCol w:w="1145"/>
+        <w:gridCol w:w="859"/>
+        <w:gridCol w:w="2954"/>
+        <w:gridCol w:w="1394"/>
+      </w:tblGrid>
+      <w:tr>
+        <w:trPr>
+          <w:cnfStyle w:val="100000000000" w:firstRow="1" w:lastRow="0" w:firstColumn="0" w:lastColumn="0" w:oddVBand="0" w:evenVBand="0" w:oddHBand="0" w:evenHBand="0" w:firstRowFirstColumn="0" w:firstRowLastColumn="0" w:lastRowFirstColumn="0" w:lastRowLastColumn="0"/>
+          <w:trHeight w:val="725"/>
+        </w:trPr>
+        <w:tc>
+          <w:tcPr>
+            <w:cnfStyle w:val="001000000000" w:firstRow="0" w:lastRow="0" w:firstColumn="1" w:lastColumn="0" w:oddVBand="0" w:evenVBand="0" w:oddHBand="0" w:evenHBand="0" w:firstRowFirstColumn="0" w:firstRowLastColumn="0" w:lastRowFirstColumn="0" w:lastRowLastColumn="0"/>
+            <w:tcW w:w="835" w:type="dxa"/>
+          </w:tcPr>
+          <w:p>
+            <w:pPr>
+              <w:spacing w:line="180" w:lineRule="auto"/>
+            </w:pPr>
+            <w:r>
+              <w:t xml:space="preserve">Sprint </w:t>
+            </w:r>
+          </w:p>
+        </w:tc>
+        <w:tc>
+          <w:tcPr>
+            <w:tcW w:w="1101" w:type="dxa"/>
+          </w:tcPr>
+          <w:p>
+            <w:pPr>
+              <w:spacing w:line="180" w:lineRule="auto"/>
+              <w:cnfStyle w:val="100000000000" w:firstRow="1" w:lastRow="0" w:firstColumn="0" w:lastColumn="0" w:oddVBand="0" w:evenVBand="0" w:oddHBand="0" w:evenHBand="0" w:firstRowFirstColumn="0" w:firstRowLastColumn="0" w:lastRowFirstColumn="0" w:lastRowLastColumn="0"/>
+            </w:pPr>
+            <w:r>
+              <w:t>Duration</w:t>
+            </w:r>
+          </w:p>
+        </w:tc>
+        <w:tc>
+          <w:tcPr>
+            <w:tcW w:w="1636" w:type="dxa"/>
+          </w:tcPr>
+          <w:p>
+            <w:pPr>
+              <w:spacing w:line="180" w:lineRule="auto"/>
+              <w:cnfStyle w:val="100000000000" w:firstRow="1" w:lastRow="0" w:firstColumn="0" w:lastColumn="0" w:oddVBand="0" w:evenVBand="0" w:oddHBand="0" w:evenHBand="0" w:firstRowFirstColumn="0" w:firstRowLastColumn="0" w:lastRowFirstColumn="0" w:lastRowLastColumn="0"/>
+            </w:pPr>
+            <w:r>
+              <w:t>Focus Area</w:t>
+            </w:r>
+          </w:p>
+        </w:tc>
+        <w:tc>
+          <w:tcPr>
+            <w:tcW w:w="1145" w:type="dxa"/>
+          </w:tcPr>
+          <w:p>
+            <w:pPr>
+              <w:spacing w:line="180" w:lineRule="auto"/>
+              <w:cnfStyle w:val="100000000000" w:firstRow="1" w:lastRow="0" w:firstColumn="0" w:lastColumn="0" w:oddVBand="0" w:evenVBand="0" w:oddHBand="0" w:evenHBand="0" w:firstRowFirstColumn="0" w:firstRowLastColumn="0" w:lastRowFirstColumn="0" w:lastRowLastColumn="0"/>
+            </w:pPr>
+            <w:r>
+              <w:t>User Stories Included</w:t>
+            </w:r>
+          </w:p>
+        </w:tc>
+        <w:tc>
+          <w:tcPr>
+            <w:tcW w:w="859" w:type="dxa"/>
+          </w:tcPr>
+          <w:p>
+            <w:pPr>
+              <w:spacing w:line="180" w:lineRule="auto"/>
+              <w:cnfStyle w:val="100000000000" w:firstRow="1" w:lastRow="0" w:firstColumn="0" w:lastColumn="0" w:oddVBand="0" w:evenVBand="0" w:oddHBand="0" w:evenHBand="0" w:firstRowFirstColumn="0" w:firstRowLastColumn="0" w:lastRowFirstColumn="0" w:lastRowLastColumn="0"/>
+            </w:pPr>
+            <w:r>
+              <w:t>Total Story Points</w:t>
+            </w:r>
+          </w:p>
+        </w:tc>
+        <w:tc>
+          <w:tcPr>
+            <w:tcW w:w="2954" w:type="dxa"/>
+          </w:tcPr>
+          <w:p>
+            <w:pPr>
+              <w:spacing w:line="180" w:lineRule="auto"/>
+              <w:cnfStyle w:val="100000000000" w:firstRow="1" w:lastRow="0" w:firstColumn="0" w:lastColumn="0" w:oddVBand="0" w:evenVBand="0" w:oddHBand="0" w:evenHBand="0" w:firstRowFirstColumn="0" w:firstRowLastColumn="0" w:lastRowFirstColumn="0" w:lastRowLastColumn="0"/>
+            </w:pPr>
+            <w:r>
+              <w:t>Goal</w:t>
+            </w:r>
+          </w:p>
+        </w:tc>
+        <w:tc>
+          <w:tcPr>
+            <w:tcW w:w="1394" w:type="dxa"/>
+          </w:tcPr>
+          <w:p>
+            <w:pPr>
+              <w:spacing w:line="180" w:lineRule="auto"/>
+              <w:cnfStyle w:val="100000000000" w:firstRow="1" w:lastRow="0" w:firstColumn="0" w:lastColumn="0" w:oddVBand="0" w:evenVBand="0" w:oddHBand="0" w:evenHBand="0" w:firstRowFirstColumn="0" w:firstRowLastColumn="0" w:lastRowFirstColumn="0" w:lastRowLastColumn="0"/>
+            </w:pPr>
+            <w:r>
+              <w:t>Status</w:t>
+            </w:r>
+          </w:p>
+        </w:tc>
+      </w:tr>
+      <w:tr>
+        <w:trPr>
+          <w:cnfStyle w:val="000000100000" w:firstRow="0" w:lastRow="0" w:firstColumn="0" w:lastColumn="0" w:oddVBand="0" w:evenVBand="0" w:oddHBand="1" w:evenHBand="0" w:firstRowFirstColumn="0" w:firstRowLastColumn="0" w:lastRowFirstColumn="0" w:lastRowLastColumn="0"/>
+          <w:trHeight w:val="1959"/>
+        </w:trPr>
+        <w:tc>
+          <w:tcPr>
+            <w:cnfStyle w:val="001000000000" w:firstRow="0" w:lastRow="0" w:firstColumn="1" w:lastColumn="0" w:oddVBand="0" w:evenVBand="0" w:oddHBand="0" w:evenHBand="0" w:firstRowFirstColumn="0" w:firstRowLastColumn="0" w:lastRowFirstColumn="0" w:lastRowLastColumn="0"/>
+            <w:tcW w:w="835" w:type="dxa"/>
+          </w:tcPr>
+          <w:p>
+            <w:pPr>
+              <w:spacing w:line="180" w:lineRule="auto"/>
+              <w:rPr>
+                <w:color w:val="000000" w:themeColor="text1"/>
+              </w:rPr>
+            </w:pPr>
+            <w:r>
+              <w:rPr>
+                <w:color w:val="000000" w:themeColor="text1"/>
+              </w:rPr>
+              <w:t xml:space="preserve">Sprint 1 </w:t>
+            </w:r>
+          </w:p>
+        </w:tc>
+        <w:tc>
+          <w:tcPr>
+            <w:tcW w:w="1101" w:type="dxa"/>
+          </w:tcPr>
+          <w:p>
+            <w:pPr>
+              <w:spacing w:line="180" w:lineRule="auto"/>
+              <w:cnfStyle w:val="000000100000" w:firstRow="0" w:lastRow="0" w:firstColumn="0" w:lastColumn="0" w:oddVBand="0" w:evenVBand="0" w:oddHBand="1" w:evenHBand="0" w:firstRowFirstColumn="0" w:firstRowLastColumn="0" w:lastRowFirstColumn="0" w:lastRowLastColumn="0"/>
+              <w:rPr>
+                <w:color w:val="000000" w:themeColor="text1"/>
+              </w:rPr>
+            </w:pPr>
+            <w:r>
+              <w:rPr>
+                <w:color w:val="000000" w:themeColor="text1"/>
+              </w:rPr>
+              <w:t>Weeks 1-2</w:t>
+            </w:r>
+          </w:p>
+        </w:tc>
+        <w:tc>
+          <w:tcPr>
+            <w:tcW w:w="1636" w:type="dxa"/>
+          </w:tcPr>
+          <w:p>
+            <w:pPr>
+              <w:spacing w:line="180" w:lineRule="auto"/>
+              <w:cnfStyle w:val="000000100000" w:firstRow="0" w:lastRow="0" w:firstColumn="0" w:lastColumn="0" w:oddVBand="0" w:evenVBand="0" w:oddHBand="1" w:evenHBand="0" w:firstRowFirstColumn="0" w:firstRowLastColumn="0" w:lastRowFirstColumn="0" w:lastRowLastColumn="0"/>
+              <w:rPr>
+                <w:color w:val="000000" w:themeColor="text1"/>
+              </w:rPr>
+            </w:pPr>
+            <w:r>
+              <w:rPr>
+                <w:color w:val="000000" w:themeColor="text1"/>
+              </w:rPr>
+              <w:t>Return Submission + Eligibility+ Duplicate Check</w:t>
+            </w:r>
+          </w:p>
+        </w:tc>
+        <w:tc>
+          <w:tcPr>
+            <w:tcW w:w="1145" w:type="dxa"/>
+          </w:tcPr>
+          <w:p>
+            <w:pPr>
+              <w:spacing w:line="180" w:lineRule="auto"/>
+              <w:cnfStyle w:val="000000100000" w:firstRow="0" w:lastRow="0" w:firstColumn="0" w:lastColumn="0" w:oddVBand="0" w:evenVBand="0" w:oddHBand="1" w:evenHBand="0" w:firstRowFirstColumn="0" w:firstRowLastColumn="0" w:lastRowFirstColumn="0" w:lastRowLastColumn="0"/>
+              <w:rPr>
+                <w:color w:val="000000" w:themeColor="text1"/>
+              </w:rPr>
+            </w:pPr>
+            <w:r>
+              <w:rPr>
+                <w:color w:val="000000" w:themeColor="text1"/>
+              </w:rPr>
+              <w:t>US-01, US-02, US-03, US-04, US-05, US-16, US-20</w:t>
+            </w:r>
+          </w:p>
+        </w:tc>
+        <w:tc>
+          <w:tcPr>
+            <w:tcW w:w="859" w:type="dxa"/>
+          </w:tcPr>
+          <w:p>
+            <w:pPr>
+              <w:spacing w:line="180" w:lineRule="auto"/>
+              <w:cnfStyle w:val="000000100000" w:firstRow="0" w:lastRow="0" w:firstColumn="0" w:lastColumn="0" w:oddVBand="0" w:evenVBand="0" w:oddHBand="1" w:evenHBand="0" w:firstRowFirstColumn="0" w:firstRowLastColumn="0" w:lastRowFirstColumn="0" w:lastRowLastColumn="0"/>
+              <w:rPr>
+                <w:color w:val="000000" w:themeColor="text1"/>
+              </w:rPr>
+            </w:pPr>
+          </w:p>
+        </w:tc>
+        <w:tc>
+          <w:tcPr>
+            <w:tcW w:w="2954" w:type="dxa"/>
+          </w:tcPr>
+          <w:p>
+            <w:pPr>
+              <w:spacing w:line="180" w:lineRule="auto"/>
+              <w:cnfStyle w:val="000000100000" w:firstRow="0" w:lastRow="0" w:firstColumn="0" w:lastColumn="0" w:oddVBand="0" w:evenVBand="0" w:oddHBand="1" w:evenHBand="0" w:firstRowFirstColumn="0" w:firstRowLastColumn="0" w:lastRowFirstColumn="0" w:lastRowLastColumn="0"/>
+              <w:rPr>
+                <w:color w:val="000000" w:themeColor="text1"/>
+              </w:rPr>
+            </w:pPr>
+            <w:r>
+              <w:rPr>
+                <w:color w:val="000000" w:themeColor="text1"/>
+              </w:rPr>
+              <w:t>Customer can submit, receive confirmation, and be blocked on duplicates. Mobile responsive.</w:t>
+            </w:r>
+          </w:p>
+        </w:tc>
+        <w:tc>
+          <w:tcPr>
+            <w:tcW w:w="1394" w:type="dxa"/>
+          </w:tcPr>
+          <w:p>
+            <w:pPr>
+              <w:spacing w:line="180" w:lineRule="auto"/>
+              <w:cnfStyle w:val="000000100000" w:firstRow="0" w:lastRow="0" w:firstColumn="0" w:lastColumn="0" w:oddVBand="0" w:evenVBand="0" w:oddHBand="1" w:evenHBand="0" w:firstRowFirstColumn="0" w:firstRowLastColumn="0" w:lastRowFirstColumn="0" w:lastRowLastColumn="0"/>
+              <w:rPr>
+                <w:color w:val="000000" w:themeColor="text1"/>
+              </w:rPr>
+            </w:pPr>
+            <w:r>
+              <w:rPr>
+                <w:color w:val="000000" w:themeColor="text1"/>
+              </w:rPr>
+              <w:t>To Do</w:t>
+            </w:r>
+          </w:p>
+        </w:tc>
+      </w:tr>
+      <w:tr>
+        <w:trPr>
+          <w:trHeight w:val="725"/>
+        </w:trPr>
+        <w:tc>
+          <w:tcPr>
+            <w:cnfStyle w:val="001000000000" w:firstRow="0" w:lastRow="0" w:firstColumn="1" w:lastColumn="0" w:oddVBand="0" w:evenVBand="0" w:oddHBand="0" w:evenHBand="0" w:firstRowFirstColumn="0" w:firstRowLastColumn="0" w:lastRowFirstColumn="0" w:lastRowLastColumn="0"/>
+            <w:tcW w:w="835" w:type="dxa"/>
+          </w:tcPr>
+          <w:p>
+            <w:pPr>
+              <w:spacing w:line="180" w:lineRule="auto"/>
+              <w:rPr>
+                <w:color w:val="000000" w:themeColor="text1"/>
+              </w:rPr>
+            </w:pPr>
+            <w:r>
+              <w:rPr>
+                <w:color w:val="000000" w:themeColor="text1"/>
+              </w:rPr>
+              <w:t>Sprint 2</w:t>
+            </w:r>
+          </w:p>
+        </w:tc>
+        <w:tc>
+          <w:tcPr>
+            <w:tcW w:w="1101" w:type="dxa"/>
+          </w:tcPr>
+          <w:p>
+            <w:pPr>
+              <w:spacing w:line="180" w:lineRule="auto"/>
+              <w:cnfStyle w:val="000000000000" w:firstRow="0" w:lastRow="0" w:firstColumn="0" w:lastColumn="0" w:oddVBand="0" w:evenVBand="0" w:oddHBand="0" w:evenHBand="0" w:firstRowFirstColumn="0" w:firstRowLastColumn="0" w:lastRowFirstColumn="0" w:lastRowLastColumn="0"/>
+              <w:rPr>
+                <w:color w:val="000000" w:themeColor="text1"/>
+              </w:rPr>
+            </w:pPr>
+            <w:r>
+              <w:rPr>
+                <w:color w:val="000000" w:themeColor="text1"/>
+              </w:rPr>
+              <w:t>Weeks 3-5</w:t>
+            </w:r>
+          </w:p>
+        </w:tc>
+        <w:tc>
+          <w:tcPr>
+            <w:tcW w:w="1636" w:type="dxa"/>
+          </w:tcPr>
+          <w:p>
+            <w:pPr>
+              <w:spacing w:line="180" w:lineRule="auto"/>
+              <w:cnfStyle w:val="000000000000" w:firstRow="0" w:lastRow="0" w:firstColumn="0" w:lastColumn="0" w:oddVBand="0" w:evenVBand="0" w:oddHBand="0" w:evenHBand="0" w:firstRowFirstColumn="0" w:firstRowLastColumn="0" w:lastRowFirstColumn="0" w:lastRowLastColumn="0"/>
+              <w:rPr>
+                <w:color w:val="000000" w:themeColor="text1"/>
+              </w:rPr>
+            </w:pPr>
+            <w:r>
+              <w:rPr>
+                <w:color w:val="000000" w:themeColor="text1"/>
+              </w:rPr>
+              <w:t>Label Generation+</w:t>
+            </w:r>
+          </w:p>
+          <w:p>
+            <w:pPr>
+              <w:spacing w:line="180" w:lineRule="auto"/>
+              <w:cnfStyle w:val="000000000000" w:firstRow="0" w:lastRow="0" w:firstColumn="0" w:lastColumn="0" w:oddVBand="0" w:evenVBand="0" w:oddHBand="0" w:evenHBand="0" w:firstRowFirstColumn="0" w:firstRowLastColumn="0" w:lastRowFirstColumn="0" w:lastRowLastColumn="0"/>
+              <w:rPr>
+                <w:color w:val="000000" w:themeColor="text1"/>
+              </w:rPr>
+            </w:pPr>
+            <w:r>
+              <w:rPr>
+                <w:color w:val="000000" w:themeColor="text1"/>
+              </w:rPr>
+              <w:t>Tracking+ Warehouse Flow</w:t>
+            </w:r>
+          </w:p>
+        </w:tc>
+        <w:tc>
+          <w:tcPr>
+            <w:tcW w:w="1145" w:type="dxa"/>
+          </w:tcPr>
+          <w:p>
+            <w:pPr>
+              <w:spacing w:line="180" w:lineRule="auto"/>
+              <w:cnfStyle w:val="000000000000" w:firstRow="0" w:lastRow="0" w:firstColumn="0" w:lastColumn="0" w:oddVBand="0" w:evenVBand="0" w:oddHBand="0" w:evenHBand="0" w:firstRowFirstColumn="0" w:firstRowLastColumn="0" w:lastRowFirstColumn="0" w:lastRowLastColumn="0"/>
+              <w:rPr>
+                <w:color w:val="000000" w:themeColor="text1"/>
+              </w:rPr>
+            </w:pPr>
+            <w:r>
+              <w:rPr>
+                <w:color w:val="000000" w:themeColor="text1"/>
+              </w:rPr>
+              <w:t>US-06, US-07, US-08, US-10, US-11, US-12</w:t>
+            </w:r>
+          </w:p>
+        </w:tc>
+        <w:tc>
+          <w:tcPr>
+            <w:tcW w:w="859" w:type="dxa"/>
+          </w:tcPr>
+          <w:p>
+            <w:pPr>
+              <w:spacing w:line="180" w:lineRule="auto"/>
+              <w:cnfStyle w:val="000000000000" w:firstRow="0" w:lastRow="0" w:firstColumn="0" w:lastColumn="0" w:oddVBand="0" w:evenVBand="0" w:oddHBand="0" w:evenHBand="0" w:firstRowFirstColumn="0" w:firstRowLastColumn="0" w:lastRowFirstColumn="0" w:lastRowLastColumn="0"/>
+              <w:rPr>
+                <w:color w:val="000000" w:themeColor="text1"/>
+              </w:rPr>
+            </w:pPr>
+          </w:p>
+        </w:tc>
+        <w:tc>
+          <w:tcPr>
+            <w:tcW w:w="2954" w:type="dxa"/>
+          </w:tcPr>
+          <w:p>
+            <w:pPr>
+              <w:spacing w:line="180" w:lineRule="auto"/>
+              <w:cnfStyle w:val="000000000000" w:firstRow="0" w:lastRow="0" w:firstColumn="0" w:lastColumn="0" w:oddVBand="0" w:evenVBand="0" w:oddHBand="0" w:evenHBand="0" w:firstRowFirstColumn="0" w:firstRowLastColumn="0" w:lastRowFirstColumn="0" w:lastRowLastColumn="0"/>
+              <w:rPr>
+                <w:color w:val="000000" w:themeColor="text1"/>
+              </w:rPr>
+            </w:pPr>
+            <w:r>
+              <w:rPr>
+                <w:color w:val="000000" w:themeColor="text1"/>
+              </w:rPr>
+              <w:t>Full return cycle : label sent, warehouse notified, receipt confirmed, refund triggered.</w:t>
+            </w:r>
+          </w:p>
+        </w:tc>
+        <w:tc>
+          <w:tcPr>
+            <w:tcW w:w="1394" w:type="dxa"/>
+          </w:tcPr>
+          <w:p>
+            <w:pPr>
+              <w:spacing w:line="180" w:lineRule="auto"/>
+              <w:cnfStyle w:val="000000000000" w:firstRow="0" w:lastRow="0" w:firstColumn="0" w:lastColumn="0" w:oddVBand="0" w:evenVBand="0" w:oddHBand="0" w:evenHBand="0" w:firstRowFirstColumn="0" w:firstRowLastColumn="0" w:lastRowFirstColumn="0" w:lastRowLastColumn="0"/>
+              <w:rPr>
+                <w:color w:val="000000" w:themeColor="text1"/>
+              </w:rPr>
+            </w:pPr>
+            <w:r>
+              <w:rPr>
+                <w:color w:val="000000" w:themeColor="text1"/>
+              </w:rPr>
+              <w:t>To Do</w:t>
+            </w:r>
+          </w:p>
+        </w:tc>
+      </w:tr>
+      <w:tr>
+        <w:trPr>
+          <w:cnfStyle w:val="000000100000" w:firstRow="0" w:lastRow="0" w:firstColumn="0" w:lastColumn="0" w:oddVBand="0" w:evenVBand="0" w:oddHBand="1" w:evenHBand="0" w:firstRowFirstColumn="0" w:firstRowLastColumn="0" w:lastRowFirstColumn="0" w:lastRowLastColumn="0"/>
+          <w:trHeight w:val="1420"/>
+        </w:trPr>
+        <w:tc>
+          <w:tcPr>
+            <w:cnfStyle w:val="001000000000" w:firstRow="0" w:lastRow="0" w:firstColumn="1" w:lastColumn="0" w:oddVBand="0" w:evenVBand="0" w:oddHBand="0" w:evenHBand="0" w:firstRowFirstColumn="0" w:firstRowLastColumn="0" w:lastRowFirstColumn="0" w:lastRowLastColumn="0"/>
+            <w:tcW w:w="835" w:type="dxa"/>
+          </w:tcPr>
+          <w:p>
+            <w:pPr>
+              <w:spacing w:line="180" w:lineRule="auto"/>
+              <w:rPr>
+                <w:color w:val="000000" w:themeColor="text1"/>
+              </w:rPr>
+            </w:pPr>
+            <w:r>
+              <w:rPr>
+                <w:color w:val="000000" w:themeColor="text1"/>
+              </w:rPr>
+              <w:lastRenderedPageBreak/>
+              <w:t>Sprint 3</w:t>
+            </w:r>
+          </w:p>
+        </w:tc>
+        <w:tc>
+          <w:tcPr>
+            <w:tcW w:w="1101" w:type="dxa"/>
+          </w:tcPr>
+          <w:p>
+            <w:pPr>
+              <w:spacing w:line="180" w:lineRule="auto"/>
+              <w:cnfStyle w:val="000000100000" w:firstRow="0" w:lastRow="0" w:firstColumn="0" w:lastColumn="0" w:oddVBand="0" w:evenVBand="0" w:oddHBand="1" w:evenHBand="0" w:firstRowFirstColumn="0" w:firstRowLastColumn="0" w:lastRowFirstColumn="0" w:lastRowLastColumn="0"/>
+              <w:rPr>
+                <w:color w:val="000000" w:themeColor="text1"/>
+              </w:rPr>
+            </w:pPr>
+            <w:r>
+              <w:rPr>
+                <w:color w:val="000000" w:themeColor="text1"/>
+              </w:rPr>
+              <w:t>Weeks 6-8</w:t>
+            </w:r>
+          </w:p>
+        </w:tc>
+        <w:tc>
+          <w:tcPr>
+            <w:tcW w:w="1636" w:type="dxa"/>
+          </w:tcPr>
+          <w:p>
+            <w:pPr>
+              <w:spacing w:line="180" w:lineRule="auto"/>
+              <w:cnfStyle w:val="000000100000" w:firstRow="0" w:lastRow="0" w:firstColumn="0" w:lastColumn="0" w:oddVBand="0" w:evenVBand="0" w:oddHBand="1" w:evenHBand="0" w:firstRowFirstColumn="0" w:firstRowLastColumn="0" w:lastRowFirstColumn="0" w:lastRowLastColumn="0"/>
+              <w:rPr>
+                <w:color w:val="000000" w:themeColor="text1"/>
+              </w:rPr>
+            </w:pPr>
+            <w:r>
+              <w:rPr>
+                <w:color w:val="000000" w:themeColor="text1"/>
+              </w:rPr>
+              <w:t>Finance Controls+ Audit+ Agent Tools</w:t>
+            </w:r>
+          </w:p>
+        </w:tc>
+        <w:tc>
+          <w:tcPr>
+            <w:tcW w:w="1145" w:type="dxa"/>
+          </w:tcPr>
+          <w:p>
+            <w:pPr>
+              <w:spacing w:line="180" w:lineRule="auto"/>
+              <w:cnfStyle w:val="000000100000" w:firstRow="0" w:lastRow="0" w:firstColumn="0" w:lastColumn="0" w:oddVBand="0" w:evenVBand="0" w:oddHBand="1" w:evenHBand="0" w:firstRowFirstColumn="0" w:firstRowLastColumn="0" w:lastRowFirstColumn="0" w:lastRowLastColumn="0"/>
+              <w:rPr>
+                <w:color w:val="000000" w:themeColor="text1"/>
+              </w:rPr>
+            </w:pPr>
+            <w:r>
+              <w:rPr>
+                <w:color w:val="000000" w:themeColor="text1"/>
+              </w:rPr>
+              <w:t>US-09, US-13, US-14, US-15, US-18</w:t>
+            </w:r>
+          </w:p>
+        </w:tc>
+        <w:tc>
+          <w:tcPr>
+            <w:tcW w:w="859" w:type="dxa"/>
+          </w:tcPr>
+          <w:p>
+            <w:pPr>
+              <w:spacing w:line="180" w:lineRule="auto"/>
+              <w:cnfStyle w:val="000000100000" w:firstRow="0" w:lastRow="0" w:firstColumn="0" w:lastColumn="0" w:oddVBand="0" w:evenVBand="0" w:oddHBand="1" w:evenHBand="0" w:firstRowFirstColumn="0" w:firstRowLastColumn="0" w:lastRowFirstColumn="0" w:lastRowLastColumn="0"/>
+              <w:rPr>
+                <w:color w:val="000000" w:themeColor="text1"/>
+              </w:rPr>
+            </w:pPr>
+          </w:p>
+        </w:tc>
+        <w:tc>
+          <w:tcPr>
+            <w:tcW w:w="2954" w:type="dxa"/>
+          </w:tcPr>
+          <w:p>
+            <w:pPr>
+              <w:spacing w:line="180" w:lineRule="auto"/>
+              <w:cnfStyle w:val="000000100000" w:firstRow="0" w:lastRow="0" w:firstColumn="0" w:lastColumn="0" w:oddVBand="0" w:evenVBand="0" w:oddHBand="1" w:evenHBand="0" w:firstRowFirstColumn="0" w:firstRowLastColumn="0" w:lastRowFirstColumn="0" w:lastRowLastColumn="0"/>
+              <w:rPr>
+                <w:color w:val="000000" w:themeColor="text1"/>
+              </w:rPr>
+            </w:pPr>
+            <w:r>
+              <w:rPr>
+                <w:color w:val="000000" w:themeColor="text1"/>
+              </w:rPr>
+              <w:t>Finance review queue, audit log, agent search and management dashboard.</w:t>
+            </w:r>
+          </w:p>
+        </w:tc>
+        <w:tc>
+          <w:tcPr>
+            <w:tcW w:w="1394" w:type="dxa"/>
+          </w:tcPr>
+          <w:p>
+            <w:pPr>
+              <w:spacing w:line="180" w:lineRule="auto"/>
+              <w:cnfStyle w:val="000000100000" w:firstRow="0" w:lastRow="0" w:firstColumn="0" w:lastColumn="0" w:oddVBand="0" w:evenVBand="0" w:oddHBand="1" w:evenHBand="0" w:firstRowFirstColumn="0" w:firstRowLastColumn="0" w:lastRowFirstColumn="0" w:lastRowLastColumn="0"/>
+              <w:rPr>
+                <w:color w:val="000000" w:themeColor="text1"/>
+              </w:rPr>
+            </w:pPr>
+            <w:r>
+              <w:rPr>
+                <w:color w:val="000000" w:themeColor="text1"/>
+              </w:rPr>
+              <w:t>To Do</w:t>
+            </w:r>
+          </w:p>
+        </w:tc>
+      </w:tr>
+      <w:tr>
+        <w:trPr>
+          <w:trHeight w:val="1256"/>
+        </w:trPr>
+        <w:tc>
+          <w:tcPr>
+            <w:cnfStyle w:val="001000000000" w:firstRow="0" w:lastRow="0" w:firstColumn="1" w:lastColumn="0" w:oddVBand="0" w:evenVBand="0" w:oddHBand="0" w:evenHBand="0" w:firstRowFirstColumn="0" w:firstRowLastColumn="0" w:lastRowFirstColumn="0" w:lastRowLastColumn="0"/>
+            <w:tcW w:w="835" w:type="dxa"/>
+          </w:tcPr>
+          <w:p>
+            <w:pPr>
+              <w:spacing w:line="180" w:lineRule="auto"/>
+              <w:rPr>
+                <w:color w:val="000000" w:themeColor="text1"/>
+              </w:rPr>
+            </w:pPr>
+            <w:r>
+              <w:rPr>
+                <w:color w:val="000000" w:themeColor="text1"/>
+              </w:rPr>
+              <w:t>Sprint 4</w:t>
+            </w:r>
+          </w:p>
+        </w:tc>
+        <w:tc>
+          <w:tcPr>
+            <w:tcW w:w="1101" w:type="dxa"/>
+          </w:tcPr>
+          <w:p>
+            <w:pPr>
+              <w:spacing w:line="180" w:lineRule="auto"/>
+              <w:cnfStyle w:val="000000000000" w:firstRow="0" w:lastRow="0" w:firstColumn="0" w:lastColumn="0" w:oddVBand="0" w:evenVBand="0" w:oddHBand="0" w:evenHBand="0" w:firstRowFirstColumn="0" w:firstRowLastColumn="0" w:lastRowFirstColumn="0" w:lastRowLastColumn="0"/>
+              <w:rPr>
+                <w:color w:val="000000" w:themeColor="text1"/>
+              </w:rPr>
+            </w:pPr>
+            <w:r>
+              <w:rPr>
+                <w:color w:val="000000" w:themeColor="text1"/>
+              </w:rPr>
+              <w:t>Weeks 9-10</w:t>
+            </w:r>
+          </w:p>
+        </w:tc>
+        <w:tc>
+          <w:tcPr>
+            <w:tcW w:w="1636" w:type="dxa"/>
+          </w:tcPr>
+          <w:p>
+            <w:pPr>
+              <w:spacing w:line="180" w:lineRule="auto"/>
+              <w:cnfStyle w:val="000000000000" w:firstRow="0" w:lastRow="0" w:firstColumn="0" w:lastColumn="0" w:oddVBand="0" w:evenVBand="0" w:oddHBand="0" w:evenHBand="0" w:firstRowFirstColumn="0" w:firstRowLastColumn="0" w:lastRowFirstColumn="0" w:lastRowLastColumn="0"/>
+              <w:rPr>
+                <w:color w:val="000000" w:themeColor="text1"/>
+              </w:rPr>
+            </w:pPr>
+            <w:r>
+              <w:rPr>
+                <w:color w:val="000000" w:themeColor="text1"/>
+              </w:rPr>
+              <w:t>Analytics + Advanced Agent Tools+ UAT</w:t>
+            </w:r>
+          </w:p>
+        </w:tc>
+        <w:tc>
+          <w:tcPr>
+            <w:tcW w:w="1145" w:type="dxa"/>
+          </w:tcPr>
+          <w:p>
+            <w:pPr>
+              <w:spacing w:line="180" w:lineRule="auto"/>
+              <w:cnfStyle w:val="000000000000" w:firstRow="0" w:lastRow="0" w:firstColumn="0" w:lastColumn="0" w:oddVBand="0" w:evenVBand="0" w:oddHBand="0" w:evenHBand="0" w:firstRowFirstColumn="0" w:firstRowLastColumn="0" w:lastRowFirstColumn="0" w:lastRowLastColumn="0"/>
+              <w:rPr>
+                <w:color w:val="000000" w:themeColor="text1"/>
+              </w:rPr>
+            </w:pPr>
+            <w:r>
+              <w:rPr>
+                <w:color w:val="000000" w:themeColor="text1"/>
+              </w:rPr>
+              <w:t>US-17, US-19</w:t>
+            </w:r>
+          </w:p>
+        </w:tc>
+        <w:tc>
+          <w:tcPr>
+            <w:tcW w:w="859" w:type="dxa"/>
+          </w:tcPr>
+          <w:p>
+            <w:pPr>
+              <w:spacing w:line="180" w:lineRule="auto"/>
+              <w:cnfStyle w:val="000000000000" w:firstRow="0" w:lastRow="0" w:firstColumn="0" w:lastColumn="0" w:oddVBand="0" w:evenVBand="0" w:oddHBand="0" w:evenHBand="0" w:firstRowFirstColumn="0" w:firstRowLastColumn="0" w:lastRowFirstColumn="0" w:lastRowLastColumn="0"/>
+              <w:rPr>
+                <w:color w:val="000000" w:themeColor="text1"/>
+              </w:rPr>
+            </w:pPr>
+          </w:p>
+        </w:tc>
+        <w:tc>
+          <w:tcPr>
+            <w:tcW w:w="2954" w:type="dxa"/>
+          </w:tcPr>
+          <w:p>
+            <w:pPr>
+              <w:spacing w:line="180" w:lineRule="auto"/>
+              <w:cnfStyle w:val="000000000000" w:firstRow="0" w:lastRow="0" w:firstColumn="0" w:lastColumn="0" w:oddVBand="0" w:evenVBand="0" w:oddHBand="0" w:evenHBand="0" w:firstRowFirstColumn="0" w:firstRowLastColumn="0" w:lastRowFirstColumn="0" w:lastRowLastColumn="0"/>
+              <w:rPr>
+                <w:color w:val="000000" w:themeColor="text1"/>
+              </w:rPr>
+            </w:pPr>
+            <w:r>
+              <w:rPr>
+                <w:color w:val="000000" w:themeColor="text1"/>
+              </w:rPr>
+              <w:t>Management analytics dashboard, agent override. UAT with stakeholders.</w:t>
+            </w:r>
+          </w:p>
+        </w:tc>
+        <w:tc>
+          <w:tcPr>
+            <w:tcW w:w="1394" w:type="dxa"/>
+          </w:tcPr>
+          <w:p>
+            <w:pPr>
+              <w:spacing w:line="180" w:lineRule="auto"/>
+              <w:cnfStyle w:val="000000000000" w:firstRow="0" w:lastRow="0" w:firstColumn="0" w:lastColumn="0" w:oddVBand="0" w:evenVBand="0" w:oddHBand="0" w:evenHBand="0" w:firstRowFirstColumn="0" w:firstRowLastColumn="0" w:lastRowFirstColumn="0" w:lastRowLastColumn="0"/>
+              <w:rPr>
+                <w:color w:val="000000" w:themeColor="text1"/>
+              </w:rPr>
+            </w:pPr>
+            <w:r>
+              <w:rPr>
+                <w:color w:val="000000" w:themeColor="text1"/>
+              </w:rPr>
+              <w:t>To Do</w:t>
+            </w:r>
+          </w:p>
+        </w:tc>
+      </w:tr>
+      <w:tr>
+        <w:trPr>
+          <w:cnfStyle w:val="000000100000" w:firstRow="0" w:lastRow="0" w:firstColumn="0" w:lastColumn="0" w:oddVBand="0" w:evenVBand="0" w:oddHBand="1" w:evenHBand="0" w:firstRowFirstColumn="0" w:firstRowLastColumn="0" w:lastRowFirstColumn="0" w:lastRowLastColumn="0"/>
+          <w:trHeight w:val="725"/>
+        </w:trPr>
+        <w:tc>
+          <w:tcPr>
+            <w:cnfStyle w:val="001000000000" w:firstRow="0" w:lastRow="0" w:firstColumn="1" w:lastColumn="0" w:oddVBand="0" w:evenVBand="0" w:oddHBand="0" w:evenHBand="0" w:firstRowFirstColumn="0" w:firstRowLastColumn="0" w:lastRowFirstColumn="0" w:lastRowLastColumn="0"/>
+            <w:tcW w:w="835" w:type="dxa"/>
+          </w:tcPr>
+          <w:p>
+            <w:pPr>
+              <w:spacing w:line="180" w:lineRule="auto"/>
+              <w:rPr>
+                <w:color w:val="000000" w:themeColor="text1"/>
+              </w:rPr>
+            </w:pPr>
+            <w:r>
+              <w:rPr>
+                <w:color w:val="000000" w:themeColor="text1"/>
+              </w:rPr>
+              <w:t>Buffer</w:t>
+            </w:r>
+          </w:p>
+        </w:tc>
+        <w:tc>
+          <w:tcPr>
+            <w:tcW w:w="1101" w:type="dxa"/>
+          </w:tcPr>
+          <w:p>
+            <w:pPr>
+              <w:spacing w:line="180" w:lineRule="auto"/>
+              <w:cnfStyle w:val="000000100000" w:firstRow="0" w:lastRow="0" w:firstColumn="0" w:lastColumn="0" w:oddVBand="0" w:evenVBand="0" w:oddHBand="1" w:evenHBand="0" w:firstRowFirstColumn="0" w:firstRowLastColumn="0" w:lastRowFirstColumn="0" w:lastRowLastColumn="0"/>
+              <w:rPr>
+                <w:color w:val="000000" w:themeColor="text1"/>
+              </w:rPr>
+            </w:pPr>
+            <w:r>
+              <w:rPr>
+                <w:color w:val="000000" w:themeColor="text1"/>
+              </w:rPr>
+              <w:t>Weeks 11-12</w:t>
+            </w:r>
+          </w:p>
+        </w:tc>
+        <w:tc>
+          <w:tcPr>
+            <w:tcW w:w="1636" w:type="dxa"/>
+          </w:tcPr>
+          <w:p>
+            <w:pPr>
+              <w:spacing w:line="180" w:lineRule="auto"/>
+              <w:cnfStyle w:val="000000100000" w:firstRow="0" w:lastRow="0" w:firstColumn="0" w:lastColumn="0" w:oddVBand="0" w:evenVBand="0" w:oddHBand="1" w:evenHBand="0" w:firstRowFirstColumn="0" w:firstRowLastColumn="0" w:lastRowFirstColumn="0" w:lastRowLastColumn="0"/>
+              <w:rPr>
+                <w:color w:val="000000" w:themeColor="text1"/>
+              </w:rPr>
+            </w:pPr>
+            <w:r>
+              <w:rPr>
+                <w:color w:val="000000" w:themeColor="text1"/>
+              </w:rPr>
+              <w:t>Bug Fixes + Performance+ Go-Live</w:t>
+            </w:r>
+          </w:p>
+        </w:tc>
+        <w:tc>
+          <w:tcPr>
+            <w:tcW w:w="1145" w:type="dxa"/>
+          </w:tcPr>
+          <w:p>
+            <w:pPr>
+              <w:spacing w:line="180" w:lineRule="auto"/>
+              <w:cnfStyle w:val="000000100000" w:firstRow="0" w:lastRow="0" w:firstColumn="0" w:lastColumn="0" w:oddVBand="0" w:evenVBand="0" w:oddHBand="1" w:evenHBand="0" w:firstRowFirstColumn="0" w:firstRowLastColumn="0" w:lastRowFirstColumn="0" w:lastRowLastColumn="0"/>
+              <w:rPr>
+                <w:color w:val="000000" w:themeColor="text1"/>
+              </w:rPr>
+            </w:pPr>
+            <w:r>
+              <w:rPr>
+                <w:color w:val="000000" w:themeColor="text1"/>
+              </w:rPr>
+              <w:t>__</w:t>
+            </w:r>
+          </w:p>
+          <w:p>
+            <w:pPr>
+              <w:spacing w:line="180" w:lineRule="auto"/>
+              <w:cnfStyle w:val="000000100000" w:firstRow="0" w:lastRow="0" w:firstColumn="0" w:lastColumn="0" w:oddVBand="0" w:evenVBand="0" w:oddHBand="1" w:evenHBand="0" w:firstRowFirstColumn="0" w:firstRowLastColumn="0" w:lastRowFirstColumn="0" w:lastRowLastColumn="0"/>
+              <w:rPr>
+                <w:color w:val="000000" w:themeColor="text1"/>
+              </w:rPr>
+            </w:pPr>
+          </w:p>
+        </w:tc>
+        <w:tc>
+          <w:tcPr>
+            <w:tcW w:w="859" w:type="dxa"/>
+          </w:tcPr>
+          <w:p>
+            <w:pPr>
+              <w:spacing w:line="180" w:lineRule="auto"/>
+              <w:cnfStyle w:val="000000100000" w:firstRow="0" w:lastRow="0" w:firstColumn="0" w:lastColumn="0" w:oddVBand="0" w:evenVBand="0" w:oddHBand="1" w:evenHBand="0" w:firstRowFirstColumn="0" w:firstRowLastColumn="0" w:lastRowFirstColumn="0" w:lastRowLastColumn="0"/>
+              <w:rPr>
+                <w:color w:val="000000" w:themeColor="text1"/>
+              </w:rPr>
+            </w:pPr>
+            <w:r>
+              <w:rPr>
+                <w:color w:val="000000" w:themeColor="text1"/>
+              </w:rPr>
+              <w:t>__</w:t>
+            </w:r>
+          </w:p>
+        </w:tc>
+        <w:tc>
+          <w:tcPr>
+            <w:tcW w:w="2954" w:type="dxa"/>
+          </w:tcPr>
+          <w:p>
+            <w:pPr>
+              <w:spacing w:line="180" w:lineRule="auto"/>
+              <w:cnfStyle w:val="000000100000" w:firstRow="0" w:lastRow="0" w:firstColumn="0" w:lastColumn="0" w:oddVBand="0" w:evenVBand="0" w:oddHBand="1" w:evenHBand="0" w:firstRowFirstColumn="0" w:firstRowLastColumn="0" w:lastRowFirstColumn="0" w:lastRowLastColumn="0"/>
+              <w:rPr>
+                <w:color w:val="000000" w:themeColor="text1"/>
+              </w:rPr>
+            </w:pPr>
+            <w:r>
+              <w:rPr>
+                <w:color w:val="000000" w:themeColor="text1"/>
+              </w:rPr>
+              <w:t>Resolve UAT findings, performance testing, production deployment.</w:t>
+            </w:r>
+          </w:p>
+        </w:tc>
+        <w:tc>
+          <w:tcPr>
+            <w:tcW w:w="1394" w:type="dxa"/>
+          </w:tcPr>
+          <w:p>
+            <w:pPr>
+              <w:spacing w:line="180" w:lineRule="auto"/>
+              <w:cnfStyle w:val="000000100000" w:firstRow="0" w:lastRow="0" w:firstColumn="0" w:lastColumn="0" w:oddVBand="0" w:evenVBand="0" w:oddHBand="1" w:evenHBand="0" w:firstRowFirstColumn="0" w:firstRowLastColumn="0" w:lastRowFirstColumn="0" w:lastRowLastColumn="0"/>
+              <w:rPr>
+                <w:color w:val="000000" w:themeColor="text1"/>
+              </w:rPr>
+            </w:pPr>
+            <w:r>
+              <w:rPr>
+                <w:color w:val="000000" w:themeColor="text1"/>
+              </w:rPr>
+              <w:t>To Do</w:t>
+            </w:r>
+          </w:p>
+        </w:tc>
+      </w:tr>
+    </w:tbl>
+    <w:p>
+      <w:pPr>
+        <w:spacing w:line="180" w:lineRule="auto"/>
+        <w:rPr>
+          <w:color w:val="000000" w:themeColor="text1"/>
+        </w:rPr>
       </w:pPr>
     </w:p>
     <w:sectPr>
@@ -4138,6 +4977,119 @@
     </w:lvl>
   </w:abstractNum>
   <w:abstractNum w:abstractNumId="7" w15:restartNumberingAfterBreak="0">
+    <w:nsid w:val="7848238C"/>
+    <w:multiLevelType w:val="hybridMultilevel"/>
+    <w:tmpl w:val="9D0ED148"/>
+    <w:lvl w:ilvl="0" w:tplc="119CCE36">
+      <w:start w:val="9"/>
+      <w:numFmt w:val="bullet"/>
+      <w:lvlText w:val=""/>
+      <w:lvlJc w:val="left"/>
+      <w:pPr>
+        <w:ind w:left="720" w:hanging="360"/>
+      </w:pPr>
+      <w:rPr>
+        <w:rFonts w:ascii="Wingdings" w:eastAsiaTheme="minorEastAsia" w:hAnsi="Wingdings" w:cstheme="minorBidi" w:hint="default"/>
+      </w:rPr>
+    </w:lvl>
+    <w:lvl w:ilvl="1" w:tplc="40090003" w:tentative="1">
+      <w:start w:val="1"/>
+      <w:numFmt w:val="bullet"/>
+      <w:lvlText w:val="o"/>
+      <w:lvlJc w:val="left"/>
+      <w:pPr>
+        <w:ind w:left="1440" w:hanging="360"/>
+      </w:pPr>
+      <w:rPr>
+        <w:rFonts w:ascii="Courier New" w:hAnsi="Courier New" w:cs="Courier New" w:hint="default"/>
+      </w:rPr>
+    </w:lvl>
+    <w:lvl w:ilvl="2" w:tplc="40090005" w:tentative="1">
+      <w:start w:val="1"/>
+      <w:numFmt w:val="bullet"/>
+      <w:lvlText w:val=""/>
+      <w:lvlJc w:val="left"/>
+      <w:pPr>
+        <w:ind w:left="2160" w:hanging="360"/>
+      </w:pPr>
+      <w:rPr>
+        <w:rFonts w:ascii="Wingdings" w:hAnsi="Wingdings" w:hint="default"/>
+      </w:rPr>
+    </w:lvl>
+    <w:lvl w:ilvl="3" w:tplc="40090001" w:tentative="1">
+      <w:start w:val="1"/>
+      <w:numFmt w:val="bullet"/>
+      <w:lvlText w:val=""/>
+      <w:lvlJc w:val="left"/>
+      <w:pPr>
+        <w:ind w:left="2880" w:hanging="360"/>
+      </w:pPr>
+      <w:rPr>
+        <w:rFonts w:ascii="Symbol" w:hAnsi="Symbol" w:hint="default"/>
+      </w:rPr>
+    </w:lvl>
+    <w:lvl w:ilvl="4" w:tplc="40090003" w:tentative="1">
+      <w:start w:val="1"/>
+      <w:numFmt w:val="bullet"/>
+      <w:lvlText w:val="o"/>
+      <w:lvlJc w:val="left"/>
+      <w:pPr>
+        <w:ind w:left="3600" w:hanging="360"/>
+      </w:pPr>
+      <w:rPr>
+        <w:rFonts w:ascii="Courier New" w:hAnsi="Courier New" w:cs="Courier New" w:hint="default"/>
+      </w:rPr>
+    </w:lvl>
+    <w:lvl w:ilvl="5" w:tplc="40090005" w:tentative="1">
+      <w:start w:val="1"/>
+      <w:numFmt w:val="bullet"/>
+      <w:lvlText w:val=""/>
+      <w:lvlJc w:val="left"/>
+      <w:pPr>
+        <w:ind w:left="4320" w:hanging="360"/>
+      </w:pPr>
+      <w:rPr>
+        <w:rFonts w:ascii="Wingdings" w:hAnsi="Wingdings" w:hint="default"/>
+      </w:rPr>
+    </w:lvl>
+    <w:lvl w:ilvl="6" w:tplc="40090001" w:tentative="1">
+      <w:start w:val="1"/>
+      <w:numFmt w:val="bullet"/>
+      <w:lvlText w:val=""/>
+      <w:lvlJc w:val="left"/>
+      <w:pPr>
+        <w:ind w:left="5040" w:hanging="360"/>
+      </w:pPr>
+      <w:rPr>
+        <w:rFonts w:ascii="Symbol" w:hAnsi="Symbol" w:hint="default"/>
+      </w:rPr>
+    </w:lvl>
+    <w:lvl w:ilvl="7" w:tplc="40090003" w:tentative="1">
+      <w:start w:val="1"/>
+      <w:numFmt w:val="bullet"/>
+      <w:lvlText w:val="o"/>
+      <w:lvlJc w:val="left"/>
+      <w:pPr>
+        <w:ind w:left="5760" w:hanging="360"/>
+      </w:pPr>
+      <w:rPr>
+        <w:rFonts w:ascii="Courier New" w:hAnsi="Courier New" w:cs="Courier New" w:hint="default"/>
+      </w:rPr>
+    </w:lvl>
+    <w:lvl w:ilvl="8" w:tplc="40090005" w:tentative="1">
+      <w:start w:val="1"/>
+      <w:numFmt w:val="bullet"/>
+      <w:lvlText w:val=""/>
+      <w:lvlJc w:val="left"/>
+      <w:pPr>
+        <w:ind w:left="6480" w:hanging="360"/>
+      </w:pPr>
+      <w:rPr>
+        <w:rFonts w:ascii="Wingdings" w:hAnsi="Wingdings" w:hint="default"/>
+      </w:rPr>
+    </w:lvl>
+  </w:abstractNum>
+  <w:abstractNum w:abstractNumId="8" w15:restartNumberingAfterBreak="0">
     <w:nsid w:val="7E8631AD"/>
     <w:multiLevelType w:val="multilevel"/>
     <w:tmpl w:val="E5F2F88A"/>
@@ -4296,7 +5248,7 @@
     <w:abstractNumId w:val="0"/>
   </w:num>
   <w:num w:numId="4" w16cid:durableId="889265647">
-    <w:abstractNumId w:val="7"/>
+    <w:abstractNumId w:val="8"/>
   </w:num>
   <w:num w:numId="5" w16cid:durableId="1853572642">
     <w:abstractNumId w:val="1"/>
@@ -4309,6 +5261,9 @@
   </w:num>
   <w:num w:numId="8" w16cid:durableId="497812820">
     <w:abstractNumId w:val="2"/>
+  </w:num>
+  <w:num w:numId="9" w16cid:durableId="1969119775">
+    <w:abstractNumId w:val="7"/>
   </w:num>
 </w:numbering>
 </file>

</xml_diff>